<commit_message>
Reference: how to create a Vertical Shorts project and what to fill in
Co-Authored-By: Claude Sonnet 5.5 <noreply@anthropic.com>
Claude-Session: https://claude.ai/code/session_01UAszi8mBYYvS2GbFNgviD8
</commit_message>
<xml_diff>
--- a/docs/reference/PRISM_Vertical_Shorts_Procedure.docx
+++ b/docs/reference/PRISM_Vertical_Shorts_Procedure.docx
@@ -226,7 +226,15 @@
         <w:pStyle w:val="Heading1"/>
       </w:pPr>
       <w:r>
-        <w:t xml:space="preserve">3. Open or create a project</w:t>
+        <w:t xml:space="preserve">3. Create a new project</w:t>
+      </w:r>
+    </w:p>
+    <w:p>
+      <w:pPr>
+        <w:spacing w:after="120"/>
+      </w:pPr>
+      <w:r>
+        <w:t xml:space="preserve">Shorts are made inside a project: the episode they are cut from. Create the project first, then make its shorts there. Everyone with access to Vertical Shorts sees every project.</w:t>
       </w:r>
     </w:p>
     <w:p>
@@ -239,20 +247,7 @@
         <w:spacing w:after="80"/>
       </w:pPr>
       <w:r>
-        <w:t xml:space="preserve">Press Vertical Shorts in the left menu.</w:t>
-      </w:r>
-    </w:p>
-    <w:p>
-      <w:pPr>
-        <w:pStyle w:val="ListParagraph"/>
-        <w:numPr>
-          <w:ilvl w:val="0"/>
-          <w:numId w:val="4"/>
-        </w:numPr>
-        <w:spacing w:after="80"/>
-      </w:pPr>
-      <w:r>
-        <w:t xml:space="preserve">Each programme or episode is a project; its cuts, settings and rendered shorts stay inside it. Use "New project" (title, episode, air date, group), or open an existing one. Press All projects to come back to this list.</w:t>
+        <w:t xml:space="preserve">Press Vertical Shorts in the left menu. The Projects list opens (Figure below).</w:t>
       </w:r>
     </w:p>
     <w:p>
@@ -319,62 +314,28 @@
     </w:p>
     <w:p>
       <w:pPr>
-        <w:pStyle w:val="Heading1"/>
-      </w:pPr>
-      <w:r>
-        <w:t xml:space="preserve">4. Source screen</w:t>
-      </w:r>
-    </w:p>
-    <w:p>
-      <w:pPr>
-        <w:pStyle w:val="ListParagraph"/>
-        <w:numPr>
-          <w:ilvl w:val="0"/>
-          <w:numId w:val="5"/>
+        <w:pStyle w:val="ListParagraph"/>
+        <w:numPr>
+          <w:ilvl w:val="0"/>
+          <w:numId w:val="4"/>
         </w:numPr>
         <w:spacing w:after="80"/>
       </w:pPr>
       <w:r>
-        <w:t xml:space="preserve">Choose the long-form video with Browse library. Add optional captions (.srt/.vtt/.scc) if you have them.</w:t>
-      </w:r>
-    </w:p>
-    <w:p>
-      <w:pPr>
-        <w:pStyle w:val="ListParagraph"/>
-        <w:numPr>
-          <w:ilvl w:val="0"/>
-          <w:numId w:val="5"/>
+        <w:t xml:space="preserve">Press New project at the top right. The New project form opens.</w:t>
+      </w:r>
+    </w:p>
+    <w:p>
+      <w:pPr>
+        <w:pStyle w:val="ListParagraph"/>
+        <w:numPr>
+          <w:ilvl w:val="0"/>
+          <w:numId w:val="4"/>
         </w:numPr>
         <w:spacing w:after="80"/>
       </w:pPr>
       <w:r>
-        <w:t xml:space="preserve">If the episode has several files, press "This episode comes in more than one part".</w:t>
-      </w:r>
-    </w:p>
-    <w:p>
-      <w:pPr>
-        <w:pStyle w:val="ListParagraph"/>
-        <w:numPr>
-          <w:ilvl w:val="0"/>
-          <w:numId w:val="5"/>
-        </w:numPr>
-        <w:spacing w:after="80"/>
-      </w:pPr>
-      <w:r>
-        <w:t xml:space="preserve">Set "What to make", the length of each short (for example 20 to 40 s), the number of moments to find, and the spoken language (Auto-detect for mixed Filipino and English).</w:t>
-      </w:r>
-    </w:p>
-    <w:p>
-      <w:pPr>
-        <w:pStyle w:val="ListParagraph"/>
-        <w:numPr>
-          <w:ilvl w:val="0"/>
-          <w:numId w:val="5"/>
-        </w:numPr>
-        <w:spacing w:after="80"/>
-      </w:pPr>
-      <w:r>
-        <w:t xml:space="preserve">Press Analyse. A queue card shows progress. When it says "Ready to review" the Moments screen opens.</w:t>
+        <w:t xml:space="preserve">Fill in the form (the table below says what goes in each field). Only the Programme title is required.</w:t>
       </w:r>
     </w:p>
     <w:p>
@@ -385,7 +346,7 @@
       <w:r>
         <w:drawing>
           <wp:inline distT="0" distB="0" distL="0" distR="0">
-            <wp:extent cx="5715000" cy="3295650"/>
+            <wp:extent cx="5715000" cy="3876675"/>
             <wp:effectExtent t="0" r="0" b="0" l="0"/>
             <wp:docPr id="1" name="" descr="" title=""/>
             <wp:cNvGraphicFramePr>
@@ -410,7 +371,7 @@
                   <pic:spPr bwMode="auto">
                     <a:xfrm>
                       <a:off x="0" y="0"/>
-                      <a:ext cx="5715000" cy="3295650"/>
+                      <a:ext cx="5715000" cy="3876675"/>
                     </a:xfrm>
                     <a:prstGeom prst="rect">
                       <a:avLst/>
@@ -436,96 +397,812 @@
           <w:sz w:val="18"/>
           <w:szCs w:val="18"/>
         </w:rPr>
-        <w:t xml:space="preserve">Figure 3. Source screen: video, length, moments and language (see steps 1 to 4)</w:t>
-      </w:r>
-    </w:p>
+        <w:t xml:space="preserve">Figure 3. New project form, filled in as an example (see steps 2 and 3)</w:t>
+      </w:r>
+    </w:p>
+    <w:tbl>
+      <w:tblPr>
+        <w:tblW w:type="dxa" w:w="9360"/>
+        <w:tblBorders>
+          <w:top w:val="single" w:color="auto" w:sz="4"/>
+          <w:left w:val="single" w:color="auto" w:sz="4"/>
+          <w:bottom w:val="single" w:color="auto" w:sz="4"/>
+          <w:right w:val="single" w:color="auto" w:sz="4"/>
+          <w:insideH w:val="single" w:color="auto" w:sz="4"/>
+          <w:insideV w:val="single" w:color="auto" w:sz="4"/>
+        </w:tblBorders>
+      </w:tblPr>
+      <w:tblGrid>
+        <w:gridCol w:w="2400"/>
+        <w:gridCol w:w="6960"/>
+      </w:tblGrid>
+      <w:tr>
+        <w:tc>
+          <w:tcPr>
+            <w:tcW w:type="dxa" w:w="2400"/>
+            <w:tcBorders>
+              <w:top w:val="single" w:color="CCCCCC" w:sz="4"/>
+              <w:left w:val="single" w:color="CCCCCC" w:sz="4"/>
+              <w:bottom w:val="single" w:color="CCCCCC" w:sz="4"/>
+              <w:right w:val="single" w:color="CCCCCC" w:sz="4"/>
+            </w:tcBorders>
+            <w:shd w:fill="F3E3E1" w:val="clear"/>
+            <w:tcMar>
+              <w:top w:type="dxa" w:w="60"/>
+              <w:left w:type="dxa" w:w="100"/>
+              <w:bottom w:type="dxa" w:w="60"/>
+              <w:right w:type="dxa" w:w="100"/>
+            </w:tcMar>
+          </w:tcPr>
+          <w:p>
+            <w:pPr>
+              <w:keepNext/>
+            </w:pPr>
+            <w:r>
+              <w:rPr>
+                <w:b/>
+                <w:bCs/>
+                <w:sz w:val="20"/>
+                <w:szCs w:val="20"/>
+              </w:rPr>
+              <w:t xml:space="preserve">Field</w:t>
+            </w:r>
+          </w:p>
+        </w:tc>
+        <w:tc>
+          <w:tcPr>
+            <w:tcW w:type="dxa" w:w="6960"/>
+            <w:tcBorders>
+              <w:top w:val="single" w:color="CCCCCC" w:sz="4"/>
+              <w:left w:val="single" w:color="CCCCCC" w:sz="4"/>
+              <w:bottom w:val="single" w:color="CCCCCC" w:sz="4"/>
+              <w:right w:val="single" w:color="CCCCCC" w:sz="4"/>
+            </w:tcBorders>
+            <w:shd w:fill="F3E3E1" w:val="clear"/>
+            <w:tcMar>
+              <w:top w:type="dxa" w:w="60"/>
+              <w:left w:type="dxa" w:w="100"/>
+              <w:bottom w:type="dxa" w:w="60"/>
+              <w:right w:type="dxa" w:w="100"/>
+            </w:tcMar>
+          </w:tcPr>
+          <w:p>
+            <w:pPr>
+              <w:keepNext/>
+            </w:pPr>
+            <w:r>
+              <w:rPr>
+                <w:b/>
+                <w:bCs/>
+                <w:sz w:val="20"/>
+                <w:szCs w:val="20"/>
+              </w:rPr>
+              <w:t xml:space="preserve">What to enter</w:t>
+            </w:r>
+          </w:p>
+        </w:tc>
+      </w:tr>
+      <w:tr>
+        <w:tc>
+          <w:tcPr>
+            <w:tcW w:type="dxa" w:w="2400"/>
+            <w:tcBorders>
+              <w:top w:val="single" w:color="CCCCCC" w:sz="4"/>
+              <w:left w:val="single" w:color="CCCCCC" w:sz="4"/>
+              <w:bottom w:val="single" w:color="CCCCCC" w:sz="4"/>
+              <w:right w:val="single" w:color="CCCCCC" w:sz="4"/>
+            </w:tcBorders>
+            <w:tcMar>
+              <w:top w:type="dxa" w:w="60"/>
+              <w:left w:type="dxa" w:w="100"/>
+              <w:bottom w:type="dxa" w:w="60"/>
+              <w:right w:type="dxa" w:w="100"/>
+            </w:tcMar>
+          </w:tcPr>
+          <w:p>
+            <w:pPr>
+              <w:keepNext w:val="false"/>
+            </w:pPr>
+            <w:r>
+              <w:rPr>
+                <w:b/>
+                <w:bCs/>
+                <w:sz w:val="20"/>
+                <w:szCs w:val="20"/>
+              </w:rPr>
+              <w:t xml:space="preserve">Programme title (required)</w:t>
+            </w:r>
+          </w:p>
+        </w:tc>
+        <w:tc>
+          <w:tcPr>
+            <w:tcW w:type="dxa" w:w="6960"/>
+            <w:tcBorders>
+              <w:top w:val="single" w:color="CCCCCC" w:sz="4"/>
+              <w:left w:val="single" w:color="CCCCCC" w:sz="4"/>
+              <w:bottom w:val="single" w:color="CCCCCC" w:sz="4"/>
+              <w:right w:val="single" w:color="CCCCCC" w:sz="4"/>
+            </w:tcBorders>
+            <w:tcMar>
+              <w:top w:type="dxa" w:w="60"/>
+              <w:left w:type="dxa" w:w="100"/>
+              <w:bottom w:type="dxa" w:w="60"/>
+              <w:right w:type="dxa" w:w="100"/>
+            </w:tcMar>
+          </w:tcPr>
+          <w:p>
+            <w:pPr>
+              <w:keepNext w:val="false"/>
+            </w:pPr>
+            <w:r>
+              <w:rPr>
+                <w:b w:val="false"/>
+                <w:bCs w:val="false"/>
+                <w:sz w:val="20"/>
+                <w:szCs w:val="20"/>
+              </w:rPr>
+              <w:t xml:space="preserve">The show name, for example Tadhana.</w:t>
+            </w:r>
+          </w:p>
+        </w:tc>
+      </w:tr>
+      <w:tr>
+        <w:tc>
+          <w:tcPr>
+            <w:tcW w:type="dxa" w:w="2400"/>
+            <w:tcBorders>
+              <w:top w:val="single" w:color="CCCCCC" w:sz="4"/>
+              <w:left w:val="single" w:color="CCCCCC" w:sz="4"/>
+              <w:bottom w:val="single" w:color="CCCCCC" w:sz="4"/>
+              <w:right w:val="single" w:color="CCCCCC" w:sz="4"/>
+            </w:tcBorders>
+            <w:tcMar>
+              <w:top w:type="dxa" w:w="60"/>
+              <w:left w:type="dxa" w:w="100"/>
+              <w:bottom w:type="dxa" w:w="60"/>
+              <w:right w:type="dxa" w:w="100"/>
+            </w:tcMar>
+          </w:tcPr>
+          <w:p>
+            <w:pPr>
+              <w:keepNext w:val="false"/>
+            </w:pPr>
+            <w:r>
+              <w:rPr>
+                <w:b/>
+                <w:bCs/>
+                <w:sz w:val="20"/>
+                <w:szCs w:val="20"/>
+              </w:rPr>
+              <w:t xml:space="preserve">Episode</w:t>
+            </w:r>
+          </w:p>
+        </w:tc>
+        <w:tc>
+          <w:tcPr>
+            <w:tcW w:type="dxa" w:w="6960"/>
+            <w:tcBorders>
+              <w:top w:val="single" w:color="CCCCCC" w:sz="4"/>
+              <w:left w:val="single" w:color="CCCCCC" w:sz="4"/>
+              <w:bottom w:val="single" w:color="CCCCCC" w:sz="4"/>
+              <w:right w:val="single" w:color="CCCCCC" w:sz="4"/>
+            </w:tcBorders>
+            <w:tcMar>
+              <w:top w:type="dxa" w:w="60"/>
+              <w:left w:type="dxa" w:w="100"/>
+              <w:bottom w:type="dxa" w:w="60"/>
+              <w:right w:type="dxa" w:w="100"/>
+            </w:tcMar>
+          </w:tcPr>
+          <w:p>
+            <w:pPr>
+              <w:keepNext w:val="false"/>
+            </w:pPr>
+            <w:r>
+              <w:rPr>
+                <w:b w:val="false"/>
+                <w:bCs w:val="false"/>
+                <w:sz w:val="20"/>
+                <w:szCs w:val="20"/>
+              </w:rPr>
+              <w:t xml:space="preserve">The episode number, for example Ep. 101.</w:t>
+            </w:r>
+          </w:p>
+        </w:tc>
+      </w:tr>
+      <w:tr>
+        <w:tc>
+          <w:tcPr>
+            <w:tcW w:type="dxa" w:w="2400"/>
+            <w:tcBorders>
+              <w:top w:val="single" w:color="CCCCCC" w:sz="4"/>
+              <w:left w:val="single" w:color="CCCCCC" w:sz="4"/>
+              <w:bottom w:val="single" w:color="CCCCCC" w:sz="4"/>
+              <w:right w:val="single" w:color="CCCCCC" w:sz="4"/>
+            </w:tcBorders>
+            <w:tcMar>
+              <w:top w:type="dxa" w:w="60"/>
+              <w:left w:type="dxa" w:w="100"/>
+              <w:bottom w:type="dxa" w:w="60"/>
+              <w:right w:type="dxa" w:w="100"/>
+            </w:tcMar>
+          </w:tcPr>
+          <w:p>
+            <w:pPr>
+              <w:keepNext w:val="false"/>
+            </w:pPr>
+            <w:r>
+              <w:rPr>
+                <w:b/>
+                <w:bCs/>
+                <w:sz w:val="20"/>
+                <w:szCs w:val="20"/>
+              </w:rPr>
+              <w:t xml:space="preserve">Episode title</w:t>
+            </w:r>
+          </w:p>
+        </w:tc>
+        <w:tc>
+          <w:tcPr>
+            <w:tcW w:type="dxa" w:w="6960"/>
+            <w:tcBorders>
+              <w:top w:val="single" w:color="CCCCCC" w:sz="4"/>
+              <w:left w:val="single" w:color="CCCCCC" w:sz="4"/>
+              <w:bottom w:val="single" w:color="CCCCCC" w:sz="4"/>
+              <w:right w:val="single" w:color="CCCCCC" w:sz="4"/>
+            </w:tcBorders>
+            <w:tcMar>
+              <w:top w:type="dxa" w:w="60"/>
+              <w:left w:type="dxa" w:w="100"/>
+              <w:bottom w:type="dxa" w:w="60"/>
+              <w:right w:type="dxa" w:w="100"/>
+            </w:tcMar>
+          </w:tcPr>
+          <w:p>
+            <w:pPr>
+              <w:keepNext w:val="false"/>
+            </w:pPr>
+            <w:r>
+              <w:rPr>
+                <w:b w:val="false"/>
+                <w:bCs w:val="false"/>
+                <w:sz w:val="20"/>
+                <w:szCs w:val="20"/>
+              </w:rPr>
+              <w:t xml:space="preserve">The title of that episode, for example Ang Pagbabalik.</w:t>
+            </w:r>
+          </w:p>
+        </w:tc>
+      </w:tr>
+      <w:tr>
+        <w:tc>
+          <w:tcPr>
+            <w:tcW w:type="dxa" w:w="2400"/>
+            <w:tcBorders>
+              <w:top w:val="single" w:color="CCCCCC" w:sz="4"/>
+              <w:left w:val="single" w:color="CCCCCC" w:sz="4"/>
+              <w:bottom w:val="single" w:color="CCCCCC" w:sz="4"/>
+              <w:right w:val="single" w:color="CCCCCC" w:sz="4"/>
+            </w:tcBorders>
+            <w:tcMar>
+              <w:top w:type="dxa" w:w="60"/>
+              <w:left w:type="dxa" w:w="100"/>
+              <w:bottom w:type="dxa" w:w="60"/>
+              <w:right w:type="dxa" w:w="100"/>
+            </w:tcMar>
+          </w:tcPr>
+          <w:p>
+            <w:pPr>
+              <w:keepNext w:val="false"/>
+            </w:pPr>
+            <w:r>
+              <w:rPr>
+                <w:b/>
+                <w:bCs/>
+                <w:sz w:val="20"/>
+                <w:szCs w:val="20"/>
+              </w:rPr>
+              <w:t xml:space="preserve">Artist/s</w:t>
+            </w:r>
+          </w:p>
+        </w:tc>
+        <w:tc>
+          <w:tcPr>
+            <w:tcW w:type="dxa" w:w="6960"/>
+            <w:tcBorders>
+              <w:top w:val="single" w:color="CCCCCC" w:sz="4"/>
+              <w:left w:val="single" w:color="CCCCCC" w:sz="4"/>
+              <w:bottom w:val="single" w:color="CCCCCC" w:sz="4"/>
+              <w:right w:val="single" w:color="CCCCCC" w:sz="4"/>
+            </w:tcBorders>
+            <w:tcMar>
+              <w:top w:type="dxa" w:w="60"/>
+              <w:left w:type="dxa" w:w="100"/>
+              <w:bottom w:type="dxa" w:w="60"/>
+              <w:right w:type="dxa" w:w="100"/>
+            </w:tcMar>
+          </w:tcPr>
+          <w:p>
+            <w:pPr>
+              <w:keepNext w:val="false"/>
+            </w:pPr>
+            <w:r>
+              <w:rPr>
+                <w:b w:val="false"/>
+                <w:bCs w:val="false"/>
+                <w:sz w:val="20"/>
+                <w:szCs w:val="20"/>
+              </w:rPr>
+              <w:t xml:space="preserve">Optional. The cast to feature, separated by commas.</w:t>
+            </w:r>
+          </w:p>
+        </w:tc>
+      </w:tr>
+      <w:tr>
+        <w:tc>
+          <w:tcPr>
+            <w:tcW w:type="dxa" w:w="2400"/>
+            <w:tcBorders>
+              <w:top w:val="single" w:color="CCCCCC" w:sz="4"/>
+              <w:left w:val="single" w:color="CCCCCC" w:sz="4"/>
+              <w:bottom w:val="single" w:color="CCCCCC" w:sz="4"/>
+              <w:right w:val="single" w:color="CCCCCC" w:sz="4"/>
+            </w:tcBorders>
+            <w:tcMar>
+              <w:top w:type="dxa" w:w="60"/>
+              <w:left w:type="dxa" w:w="100"/>
+              <w:bottom w:type="dxa" w:w="60"/>
+              <w:right w:type="dxa" w:w="100"/>
+            </w:tcMar>
+          </w:tcPr>
+          <w:p>
+            <w:pPr>
+              <w:keepNext w:val="false"/>
+            </w:pPr>
+            <w:r>
+              <w:rPr>
+                <w:b/>
+                <w:bCs/>
+                <w:sz w:val="20"/>
+                <w:szCs w:val="20"/>
+              </w:rPr>
+              <w:t xml:space="preserve">Air date</w:t>
+            </w:r>
+          </w:p>
+        </w:tc>
+        <w:tc>
+          <w:tcPr>
+            <w:tcW w:type="dxa" w:w="6960"/>
+            <w:tcBorders>
+              <w:top w:val="single" w:color="CCCCCC" w:sz="4"/>
+              <w:left w:val="single" w:color="CCCCCC" w:sz="4"/>
+              <w:bottom w:val="single" w:color="CCCCCC" w:sz="4"/>
+              <w:right w:val="single" w:color="CCCCCC" w:sz="4"/>
+            </w:tcBorders>
+            <w:tcMar>
+              <w:top w:type="dxa" w:w="60"/>
+              <w:left w:type="dxa" w:w="100"/>
+              <w:bottom w:type="dxa" w:w="60"/>
+              <w:right w:type="dxa" w:w="100"/>
+            </w:tcMar>
+          </w:tcPr>
+          <w:p>
+            <w:pPr>
+              <w:keepNext w:val="false"/>
+            </w:pPr>
+            <w:r>
+              <w:rPr>
+                <w:b w:val="false"/>
+                <w:bCs w:val="false"/>
+                <w:sz w:val="20"/>
+                <w:szCs w:val="20"/>
+              </w:rPr>
+              <w:t xml:space="preserve">The date the episode airs. The form suggests today.</w:t>
+            </w:r>
+          </w:p>
+        </w:tc>
+      </w:tr>
+      <w:tr>
+        <w:tc>
+          <w:tcPr>
+            <w:tcW w:type="dxa" w:w="2400"/>
+            <w:tcBorders>
+              <w:top w:val="single" w:color="CCCCCC" w:sz="4"/>
+              <w:left w:val="single" w:color="CCCCCC" w:sz="4"/>
+              <w:bottom w:val="single" w:color="CCCCCC" w:sz="4"/>
+              <w:right w:val="single" w:color="CCCCCC" w:sz="4"/>
+            </w:tcBorders>
+            <w:tcMar>
+              <w:top w:type="dxa" w:w="60"/>
+              <w:left w:type="dxa" w:w="100"/>
+              <w:bottom w:type="dxa" w:w="60"/>
+              <w:right w:type="dxa" w:w="100"/>
+            </w:tcMar>
+          </w:tcPr>
+          <w:p>
+            <w:pPr>
+              <w:keepNext w:val="false"/>
+            </w:pPr>
+            <w:r>
+              <w:rPr>
+                <w:b/>
+                <w:bCs/>
+                <w:sz w:val="20"/>
+                <w:szCs w:val="20"/>
+              </w:rPr>
+              <w:t xml:space="preserve">Status</w:t>
+            </w:r>
+          </w:p>
+        </w:tc>
+        <w:tc>
+          <w:tcPr>
+            <w:tcW w:type="dxa" w:w="6960"/>
+            <w:tcBorders>
+              <w:top w:val="single" w:color="CCCCCC" w:sz="4"/>
+              <w:left w:val="single" w:color="CCCCCC" w:sz="4"/>
+              <w:bottom w:val="single" w:color="CCCCCC" w:sz="4"/>
+              <w:right w:val="single" w:color="CCCCCC" w:sz="4"/>
+            </w:tcBorders>
+            <w:tcMar>
+              <w:top w:type="dxa" w:w="60"/>
+              <w:left w:type="dxa" w:w="100"/>
+              <w:bottom w:type="dxa" w:w="60"/>
+              <w:right w:type="dxa" w:w="100"/>
+            </w:tcMar>
+          </w:tcPr>
+          <w:p>
+            <w:pPr>
+              <w:keepNext w:val="false"/>
+            </w:pPr>
+            <w:r>
+              <w:rPr>
+                <w:b w:val="false"/>
+                <w:bCs w:val="false"/>
+                <w:sz w:val="20"/>
+                <w:szCs w:val="20"/>
+              </w:rPr>
+              <w:t xml:space="preserve">New for a project just started; change it as the work moves on.</w:t>
+            </w:r>
+          </w:p>
+        </w:tc>
+      </w:tr>
+      <w:tr>
+        <w:tc>
+          <w:tcPr>
+            <w:tcW w:type="dxa" w:w="2400"/>
+            <w:tcBorders>
+              <w:top w:val="single" w:color="CCCCCC" w:sz="4"/>
+              <w:left w:val="single" w:color="CCCCCC" w:sz="4"/>
+              <w:bottom w:val="single" w:color="CCCCCC" w:sz="4"/>
+              <w:right w:val="single" w:color="CCCCCC" w:sz="4"/>
+            </w:tcBorders>
+            <w:tcMar>
+              <w:top w:type="dxa" w:w="60"/>
+              <w:left w:type="dxa" w:w="100"/>
+              <w:bottom w:type="dxa" w:w="60"/>
+              <w:right w:type="dxa" w:w="100"/>
+            </w:tcMar>
+          </w:tcPr>
+          <w:p>
+            <w:pPr>
+              <w:keepNext w:val="false"/>
+            </w:pPr>
+            <w:r>
+              <w:rPr>
+                <w:b/>
+                <w:bCs/>
+                <w:sz w:val="20"/>
+                <w:szCs w:val="20"/>
+              </w:rPr>
+              <w:t xml:space="preserve">Assigned to</w:t>
+            </w:r>
+          </w:p>
+        </w:tc>
+        <w:tc>
+          <w:tcPr>
+            <w:tcW w:type="dxa" w:w="6960"/>
+            <w:tcBorders>
+              <w:top w:val="single" w:color="CCCCCC" w:sz="4"/>
+              <w:left w:val="single" w:color="CCCCCC" w:sz="4"/>
+              <w:bottom w:val="single" w:color="CCCCCC" w:sz="4"/>
+              <w:right w:val="single" w:color="CCCCCC" w:sz="4"/>
+            </w:tcBorders>
+            <w:tcMar>
+              <w:top w:type="dxa" w:w="60"/>
+              <w:left w:type="dxa" w:w="100"/>
+              <w:bottom w:type="dxa" w:w="60"/>
+              <w:right w:type="dxa" w:w="100"/>
+            </w:tcMar>
+          </w:tcPr>
+          <w:p>
+            <w:pPr>
+              <w:keepNext w:val="false"/>
+            </w:pPr>
+            <w:r>
+              <w:rPr>
+                <w:b w:val="false"/>
+                <w:bCs w:val="false"/>
+                <w:sz w:val="20"/>
+                <w:szCs w:val="20"/>
+              </w:rPr>
+              <w:t xml:space="preserve">The team member responsible, or Unassigned.</w:t>
+            </w:r>
+          </w:p>
+        </w:tc>
+      </w:tr>
+      <w:tr>
+        <w:tc>
+          <w:tcPr>
+            <w:tcW w:type="dxa" w:w="2400"/>
+            <w:tcBorders>
+              <w:top w:val="single" w:color="CCCCCC" w:sz="4"/>
+              <w:left w:val="single" w:color="CCCCCC" w:sz="4"/>
+              <w:bottom w:val="single" w:color="CCCCCC" w:sz="4"/>
+              <w:right w:val="single" w:color="CCCCCC" w:sz="4"/>
+            </w:tcBorders>
+            <w:tcMar>
+              <w:top w:type="dxa" w:w="60"/>
+              <w:left w:type="dxa" w:w="100"/>
+              <w:bottom w:type="dxa" w:w="60"/>
+              <w:right w:type="dxa" w:w="100"/>
+            </w:tcMar>
+          </w:tcPr>
+          <w:p>
+            <w:pPr>
+              <w:keepNext w:val="false"/>
+            </w:pPr>
+            <w:r>
+              <w:rPr>
+                <w:b/>
+                <w:bCs/>
+                <w:sz w:val="20"/>
+                <w:szCs w:val="20"/>
+              </w:rPr>
+              <w:t xml:space="preserve">Group</w:t>
+            </w:r>
+          </w:p>
+        </w:tc>
+        <w:tc>
+          <w:tcPr>
+            <w:tcW w:type="dxa" w:w="6960"/>
+            <w:tcBorders>
+              <w:top w:val="single" w:color="CCCCCC" w:sz="4"/>
+              <w:left w:val="single" w:color="CCCCCC" w:sz="4"/>
+              <w:bottom w:val="single" w:color="CCCCCC" w:sz="4"/>
+              <w:right w:val="single" w:color="CCCCCC" w:sz="4"/>
+            </w:tcBorders>
+            <w:tcMar>
+              <w:top w:type="dxa" w:w="60"/>
+              <w:left w:type="dxa" w:w="100"/>
+              <w:bottom w:type="dxa" w:w="60"/>
+              <w:right w:type="dxa" w:w="100"/>
+            </w:tcMar>
+          </w:tcPr>
+          <w:p>
+            <w:pPr>
+              <w:keepNext w:val="false"/>
+            </w:pPr>
+            <w:r>
+              <w:rPr>
+                <w:b w:val="false"/>
+                <w:bCs w:val="false"/>
+                <w:sz w:val="20"/>
+                <w:szCs w:val="20"/>
+              </w:rPr>
+              <w:t xml:space="preserve">Shows your own group. It is not typed in.</w:t>
+            </w:r>
+          </w:p>
+        </w:tc>
+      </w:tr>
+      <w:tr>
+        <w:tc>
+          <w:tcPr>
+            <w:tcW w:type="dxa" w:w="2400"/>
+            <w:tcBorders>
+              <w:top w:val="single" w:color="CCCCCC" w:sz="4"/>
+              <w:left w:val="single" w:color="CCCCCC" w:sz="4"/>
+              <w:bottom w:val="single" w:color="CCCCCC" w:sz="4"/>
+              <w:right w:val="single" w:color="CCCCCC" w:sz="4"/>
+            </w:tcBorders>
+            <w:tcMar>
+              <w:top w:type="dxa" w:w="60"/>
+              <w:left w:type="dxa" w:w="100"/>
+              <w:bottom w:type="dxa" w:w="60"/>
+              <w:right w:type="dxa" w:w="100"/>
+            </w:tcMar>
+          </w:tcPr>
+          <w:p>
+            <w:pPr>
+              <w:keepNext w:val="false"/>
+            </w:pPr>
+            <w:r>
+              <w:rPr>
+                <w:b/>
+                <w:bCs/>
+                <w:sz w:val="20"/>
+                <w:szCs w:val="20"/>
+              </w:rPr>
+              <w:t xml:space="preserve">Has a deadline</w:t>
+            </w:r>
+          </w:p>
+        </w:tc>
+        <w:tc>
+          <w:tcPr>
+            <w:tcW w:type="dxa" w:w="6960"/>
+            <w:tcBorders>
+              <w:top w:val="single" w:color="CCCCCC" w:sz="4"/>
+              <w:left w:val="single" w:color="CCCCCC" w:sz="4"/>
+              <w:bottom w:val="single" w:color="CCCCCC" w:sz="4"/>
+              <w:right w:val="single" w:color="CCCCCC" w:sz="4"/>
+            </w:tcBorders>
+            <w:tcMar>
+              <w:top w:type="dxa" w:w="60"/>
+              <w:left w:type="dxa" w:w="100"/>
+              <w:bottom w:type="dxa" w:w="60"/>
+              <w:right w:type="dxa" w:w="100"/>
+            </w:tcMar>
+          </w:tcPr>
+          <w:p>
+            <w:pPr>
+              <w:keepNext w:val="false"/>
+            </w:pPr>
+            <w:r>
+              <w:rPr>
+                <w:b w:val="false"/>
+                <w:bCs w:val="false"/>
+                <w:sz w:val="20"/>
+                <w:szCs w:val="20"/>
+              </w:rPr>
+              <w:t xml:space="preserve">Tick it to enter a due date.</w:t>
+            </w:r>
+          </w:p>
+        </w:tc>
+      </w:tr>
+      <w:tr>
+        <w:tc>
+          <w:tcPr>
+            <w:tcW w:type="dxa" w:w="2400"/>
+            <w:tcBorders>
+              <w:top w:val="single" w:color="CCCCCC" w:sz="4"/>
+              <w:left w:val="single" w:color="CCCCCC" w:sz="4"/>
+              <w:bottom w:val="single" w:color="CCCCCC" w:sz="4"/>
+              <w:right w:val="single" w:color="CCCCCC" w:sz="4"/>
+            </w:tcBorders>
+            <w:tcMar>
+              <w:top w:type="dxa" w:w="60"/>
+              <w:left w:type="dxa" w:w="100"/>
+              <w:bottom w:type="dxa" w:w="60"/>
+              <w:right w:type="dxa" w:w="100"/>
+            </w:tcMar>
+          </w:tcPr>
+          <w:p>
+            <w:pPr>
+              <w:keepNext w:val="false"/>
+            </w:pPr>
+            <w:r>
+              <w:rPr>
+                <w:b/>
+                <w:bCs/>
+                <w:sz w:val="20"/>
+                <w:szCs w:val="20"/>
+              </w:rPr>
+              <w:t xml:space="preserve">Thumbnail</w:t>
+            </w:r>
+          </w:p>
+        </w:tc>
+        <w:tc>
+          <w:tcPr>
+            <w:tcW w:type="dxa" w:w="6960"/>
+            <w:tcBorders>
+              <w:top w:val="single" w:color="CCCCCC" w:sz="4"/>
+              <w:left w:val="single" w:color="CCCCCC" w:sz="4"/>
+              <w:bottom w:val="single" w:color="CCCCCC" w:sz="4"/>
+              <w:right w:val="single" w:color="CCCCCC" w:sz="4"/>
+            </w:tcBorders>
+            <w:tcMar>
+              <w:top w:type="dxa" w:w="60"/>
+              <w:left w:type="dxa" w:w="100"/>
+              <w:bottom w:type="dxa" w:w="60"/>
+              <w:right w:type="dxa" w:w="100"/>
+            </w:tcMar>
+          </w:tcPr>
+          <w:p>
+            <w:pPr>
+              <w:keepNext w:val="false"/>
+            </w:pPr>
+            <w:r>
+              <w:rPr>
+                <w:b w:val="false"/>
+                <w:bCs w:val="false"/>
+                <w:sz w:val="20"/>
+                <w:szCs w:val="20"/>
+              </w:rPr>
+              <w:t xml:space="preserve">Optional picture (JPEG, PNG or WebP). Without one, the project shows a frame from its newest short once it has one.</w:t>
+            </w:r>
+          </w:p>
+        </w:tc>
+      </w:tr>
+      <w:tr>
+        <w:tc>
+          <w:tcPr>
+            <w:tcW w:type="dxa" w:w="2400"/>
+            <w:tcBorders>
+              <w:top w:val="single" w:color="CCCCCC" w:sz="4"/>
+              <w:left w:val="single" w:color="CCCCCC" w:sz="4"/>
+              <w:bottom w:val="single" w:color="CCCCCC" w:sz="4"/>
+              <w:right w:val="single" w:color="CCCCCC" w:sz="4"/>
+            </w:tcBorders>
+            <w:tcMar>
+              <w:top w:type="dxa" w:w="60"/>
+              <w:left w:type="dxa" w:w="100"/>
+              <w:bottom w:type="dxa" w:w="60"/>
+              <w:right w:type="dxa" w:w="100"/>
+            </w:tcMar>
+          </w:tcPr>
+          <w:p>
+            <w:pPr>
+              <w:keepNext w:val="false"/>
+            </w:pPr>
+            <w:r>
+              <w:rPr>
+                <w:b/>
+                <w:bCs/>
+                <w:sz w:val="20"/>
+                <w:szCs w:val="20"/>
+              </w:rPr>
+              <w:t xml:space="preserve">Description</w:t>
+            </w:r>
+          </w:p>
+        </w:tc>
+        <w:tc>
+          <w:tcPr>
+            <w:tcW w:type="dxa" w:w="6960"/>
+            <w:tcBorders>
+              <w:top w:val="single" w:color="CCCCCC" w:sz="4"/>
+              <w:left w:val="single" w:color="CCCCCC" w:sz="4"/>
+              <w:bottom w:val="single" w:color="CCCCCC" w:sz="4"/>
+              <w:right w:val="single" w:color="CCCCCC" w:sz="4"/>
+            </w:tcBorders>
+            <w:tcMar>
+              <w:top w:type="dxa" w:w="60"/>
+              <w:left w:type="dxa" w:w="100"/>
+              <w:bottom w:type="dxa" w:w="60"/>
+              <w:right w:type="dxa" w:w="100"/>
+            </w:tcMar>
+          </w:tcPr>
+          <w:p>
+            <w:pPr>
+              <w:keepNext w:val="false"/>
+            </w:pPr>
+            <w:r>
+              <w:rPr>
+                <w:b w:val="false"/>
+                <w:bCs w:val="false"/>
+                <w:sz w:val="20"/>
+                <w:szCs w:val="20"/>
+              </w:rPr>
+              <w:t xml:space="preserve">Optional notes: what the episode is about, who it is for, anything the next person should know.</w:t>
+            </w:r>
+          </w:p>
+        </w:tc>
+      </w:tr>
+    </w:tbl>
     <w:p>
       <w:pPr>
         <w:spacing w:after="120"/>
       </w:pPr>
-      <w:r>
-        <w:t xml:space="preserve">Earlier cuts of this project are listed at the top. Press Open to return to one without re-analysing; they are kept 14 days after last opened.</w:t>
-      </w:r>
-    </w:p>
-    <w:p>
-      <w:pPr>
-        <w:pStyle w:val="Heading1"/>
-      </w:pPr>
-      <w:r>
-        <w:t xml:space="preserve">5. More options</w:t>
-      </w:r>
-    </w:p>
-    <w:p>
-      <w:pPr>
-        <w:spacing w:after="120"/>
-      </w:pPr>
-      <w:r>
-        <w:t xml:space="preserve">Open "More options" to steer the result.</w:t>
-      </w:r>
-    </w:p>
-    <w:p>
-      <w:pPr>
-        <w:pStyle w:val="ListParagraph"/>
-        <w:numPr>
-          <w:ilvl w:val="0"/>
-          <w:numId w:val="6"/>
-        </w:numPr>
-        <w:spacing w:after="60"/>
-      </w:pPr>
-      <w:r>
-        <w:t xml:space="preserve">Feature / avoid: say what to prefer or keep out of the shorts.</w:t>
-      </w:r>
-    </w:p>
-    <w:p>
-      <w:pPr>
-        <w:pStyle w:val="ListParagraph"/>
-        <w:numPr>
-          <w:ilvl w:val="0"/>
-          <w:numId w:val="6"/>
-        </w:numPr>
-        <w:spacing w:after="60"/>
-      </w:pPr>
-      <w:r>
-        <w:t xml:space="preserve">Names and terms: character and place names, so the captions spell them right.</w:t>
-      </w:r>
-    </w:p>
-    <w:p>
-      <w:pPr>
-        <w:pStyle w:val="ListParagraph"/>
-        <w:numPr>
-          <w:ilvl w:val="0"/>
-          <w:numId w:val="6"/>
-        </w:numPr>
-        <w:spacing w:after="60"/>
-      </w:pPr>
-      <w:r>
-        <w:t xml:space="preserve">Leave out of every short: billboards, sponsor reads, credits, narration, host talk, recaps, teasers, black, logos, title cards, and talking heads. All are ticked by default; untick one to allow it.</w:t>
-      </w:r>
-    </w:p>
-    <w:p>
-      <w:pPr>
-        <w:pStyle w:val="ListParagraph"/>
-        <w:numPr>
-          <w:ilvl w:val="0"/>
-          <w:numId w:val="6"/>
-        </w:numPr>
-        <w:spacing w:after="60"/>
-      </w:pPr>
-      <w:r>
-        <w:t xml:space="preserve">Leave out these parts: time ranges such as 0:00-1:45, 22:10-23:30 that no moment may include.</w:t>
-      </w:r>
-    </w:p>
-    <w:p>
-      <w:pPr>
-        <w:pStyle w:val="ListParagraph"/>
-        <w:numPr>
-          <w:ilvl w:val="0"/>
-          <w:numId w:val="6"/>
-        </w:numPr>
-        <w:spacing w:after="60"/>
-      </w:pPr>
-      <w:r>
-        <w:t xml:space="preserve">Advanced: choose the AI vision model, story model, and frames to rate.</w:t>
+    </w:p>
+    <w:p>
+      <w:pPr>
+        <w:pStyle w:val="ListParagraph"/>
+        <w:numPr>
+          <w:ilvl w:val="0"/>
+          <w:numId w:val="4"/>
+        </w:numPr>
+        <w:spacing w:after="80"/>
+      </w:pPr>
+      <w:r>
+        <w:t xml:space="preserve">Press Create project. The project page opens with its title, episode, air date and status at the top, and the Source screen below, ready for the video (Figure below). Press Cancel instead to close the form without saving.</w:t>
       </w:r>
     </w:p>
     <w:p>
@@ -536,7 +1213,7 @@
       <w:r>
         <w:drawing>
           <wp:inline distT="0" distB="0" distL="0" distR="0">
-            <wp:extent cx="5715000" cy="2657475"/>
+            <wp:extent cx="5715000" cy="1333500"/>
             <wp:effectExtent t="0" r="0" b="0" l="0"/>
             <wp:docPr id="1" name="" descr="" title=""/>
             <wp:cNvGraphicFramePr>
@@ -561,7 +1238,7 @@
                   <pic:spPr bwMode="auto">
                     <a:xfrm>
                       <a:off x="0" y="0"/>
-                      <a:ext cx="5715000" cy="2657475"/>
+                      <a:ext cx="5715000" cy="1333500"/>
                     </a:xfrm>
                     <a:prstGeom prst="rect">
                       <a:avLst/>
@@ -587,7 +1264,20 @@
           <w:sz w:val="18"/>
           <w:szCs w:val="18"/>
         </w:rPr>
-        <w:t xml:space="preserve">Figure 4. More options</w:t>
+        <w:t xml:space="preserve">Figure 4. The new project page (see step 4)</w:t>
+      </w:r>
+    </w:p>
+    <w:p>
+      <w:pPr>
+        <w:pStyle w:val="ListParagraph"/>
+        <w:numPr>
+          <w:ilvl w:val="0"/>
+          <w:numId w:val="4"/>
+        </w:numPr>
+        <w:spacing w:after="80"/>
+      </w:pPr>
+      <w:r>
+        <w:t xml:space="preserve">Later, press Edit details to change any field, or Delete project to remove it. Press All projects to go back to the list, and open any project by clicking it.</w:t>
       </w:r>
     </w:p>
     <w:p>
@@ -595,93 +1285,59 @@
         <w:pStyle w:val="Heading1"/>
       </w:pPr>
       <w:r>
-        <w:t xml:space="preserve">6. Output settings</w:t>
-      </w:r>
-    </w:p>
-    <w:p>
-      <w:pPr>
-        <w:spacing w:after="120"/>
-      </w:pPr>
-      <w:r>
-        <w:t xml:space="preserve">Output settings holds the defaults for the batch. They are saved to the project, and you can save a set as a template.</w:t>
-      </w:r>
-    </w:p>
-    <w:p>
-      <w:pPr>
-        <w:pStyle w:val="ListParagraph"/>
-        <w:numPr>
-          <w:ilvl w:val="0"/>
-          <w:numId w:val="6"/>
-        </w:numPr>
-        <w:spacing w:after="60"/>
-      </w:pPr>
-      <w:r>
-        <w:t xml:space="preserve">Framing: Auto reframes two-shots by splitting the screen, else follows the subject. "Follow the speaker" tracks who talks.</w:t>
-      </w:r>
-    </w:p>
-    <w:p>
-      <w:pPr>
-        <w:pStyle w:val="ListParagraph"/>
-        <w:numPr>
-          <w:ilvl w:val="0"/>
-          <w:numId w:val="6"/>
-        </w:numPr>
-        <w:spacing w:after="60"/>
-      </w:pPr>
-      <w:r>
-        <w:t xml:space="preserve">Cuts: how pieces join (short crossfade by default).</w:t>
-      </w:r>
-    </w:p>
-    <w:p>
-      <w:pPr>
-        <w:pStyle w:val="ListParagraph"/>
-        <w:numPr>
-          <w:ilvl w:val="0"/>
-          <w:numId w:val="6"/>
-        </w:numPr>
-        <w:spacing w:after="60"/>
-      </w:pPr>
-      <w:r>
-        <w:t xml:space="preserve">Captions: burn in, size, position over a split screen (on the join between the panes or low), and Word highlighting.</w:t>
-      </w:r>
-    </w:p>
-    <w:p>
-      <w:pPr>
-        <w:pStyle w:val="ListParagraph"/>
-        <w:numPr>
-          <w:ilvl w:val="0"/>
-          <w:numId w:val="6"/>
-        </w:numPr>
-        <w:spacing w:after="60"/>
-      </w:pPr>
-      <w:r>
-        <w:t xml:space="preserve">EP labels: opening label (for example "EP {n}") and closing label (for example "NEXT: EP {n} &gt;&gt;"). Type any wording; {n} is the number.</w:t>
-      </w:r>
-    </w:p>
-    <w:p>
-      <w:pPr>
-        <w:pStyle w:val="ListParagraph"/>
-        <w:numPr>
-          <w:ilvl w:val="0"/>
-          <w:numId w:val="6"/>
-        </w:numPr>
-        <w:spacing w:after="60"/>
-      </w:pPr>
-      <w:r>
-        <w:t xml:space="preserve">Delivery: file format and audio level (for example -14 LUFS for online video).</w:t>
-      </w:r>
-    </w:p>
-    <w:p>
-      <w:pPr>
-        <w:pStyle w:val="ListParagraph"/>
-        <w:numPr>
-          <w:ilvl w:val="0"/>
-          <w:numId w:val="6"/>
-        </w:numPr>
-        <w:spacing w:after="60"/>
-      </w:pPr>
-      <w:r>
-        <w:t xml:space="preserve">Ending: the last short can fade to black, so the cliffhanger is not cut or held.</w:t>
+        <w:t xml:space="preserve">4. Source screen</w:t>
+      </w:r>
+    </w:p>
+    <w:p>
+      <w:pPr>
+        <w:pStyle w:val="ListParagraph"/>
+        <w:numPr>
+          <w:ilvl w:val="0"/>
+          <w:numId w:val="5"/>
+        </w:numPr>
+        <w:spacing w:after="80"/>
+      </w:pPr>
+      <w:r>
+        <w:t xml:space="preserve">Choose the long-form video with Browse library. Add optional captions (.srt/.vtt/.scc) if you have them.</w:t>
+      </w:r>
+    </w:p>
+    <w:p>
+      <w:pPr>
+        <w:pStyle w:val="ListParagraph"/>
+        <w:numPr>
+          <w:ilvl w:val="0"/>
+          <w:numId w:val="5"/>
+        </w:numPr>
+        <w:spacing w:after="80"/>
+      </w:pPr>
+      <w:r>
+        <w:t xml:space="preserve">If the episode has several files, press "This episode comes in more than one part".</w:t>
+      </w:r>
+    </w:p>
+    <w:p>
+      <w:pPr>
+        <w:pStyle w:val="ListParagraph"/>
+        <w:numPr>
+          <w:ilvl w:val="0"/>
+          <w:numId w:val="5"/>
+        </w:numPr>
+        <w:spacing w:after="80"/>
+      </w:pPr>
+      <w:r>
+        <w:t xml:space="preserve">Set "What to make", the length of each short (for example 20 to 40 s), the number of moments to find, and the spoken language (Auto-detect for mixed Filipino and English).</w:t>
+      </w:r>
+    </w:p>
+    <w:p>
+      <w:pPr>
+        <w:pStyle w:val="ListParagraph"/>
+        <w:numPr>
+          <w:ilvl w:val="0"/>
+          <w:numId w:val="5"/>
+        </w:numPr>
+        <w:spacing w:after="80"/>
+      </w:pPr>
+      <w:r>
+        <w:t xml:space="preserve">Press Analyse. A queue card shows progress. When it says "Ready to review" the Moments screen opens.</w:t>
       </w:r>
     </w:p>
     <w:p>
@@ -692,7 +1348,7 @@
       <w:r>
         <w:drawing>
           <wp:inline distT="0" distB="0" distL="0" distR="0">
-            <wp:extent cx="4572000" cy="4095750"/>
+            <wp:extent cx="5715000" cy="3295650"/>
             <wp:effectExtent t="0" r="0" b="0" l="0"/>
             <wp:docPr id="1" name="" descr="" title=""/>
             <wp:cNvGraphicFramePr>
@@ -717,7 +1373,7 @@
                   <pic:spPr bwMode="auto">
                     <a:xfrm>
                       <a:off x="0" y="0"/>
-                      <a:ext cx="4572000" cy="4095750"/>
+                      <a:ext cx="5715000" cy="3295650"/>
                     </a:xfrm>
                     <a:prstGeom prst="rect">
                       <a:avLst/>
@@ -743,7 +1399,15 @@
           <w:sz w:val="18"/>
           <w:szCs w:val="18"/>
         </w:rPr>
-        <w:t xml:space="preserve">Figure 5. Output settings panel</w:t>
+        <w:t xml:space="preserve">Figure 5. Source screen: video, length, moments and language (see steps 1 to 4)</w:t>
+      </w:r>
+    </w:p>
+    <w:p>
+      <w:pPr>
+        <w:spacing w:after="120"/>
+      </w:pPr>
+      <w:r>
+        <w:t xml:space="preserve">Earlier cuts of this project are listed at the top. Press Open to return to one without re-analysing; they are kept 14 days after last opened.</w:t>
       </w:r>
     </w:p>
     <w:p>
@@ -751,7 +1415,7 @@
         <w:pStyle w:val="Heading1"/>
       </w:pPr>
       <w:r>
-        <w:t xml:space="preserve">7. Moments screen</w:t>
+        <w:t xml:space="preserve">5. More options</w:t>
       </w:r>
     </w:p>
     <w:p>
@@ -759,7 +1423,72 @@
         <w:spacing w:after="120"/>
       </w:pPr>
       <w:r>
-        <w:t xml:space="preserve">The left list holds the proposed shorts with a score. Use "Add your own moment" for a cut the AI missed.</w:t>
+        <w:t xml:space="preserve">Open "More options" to steer the result.</w:t>
+      </w:r>
+    </w:p>
+    <w:p>
+      <w:pPr>
+        <w:pStyle w:val="ListParagraph"/>
+        <w:numPr>
+          <w:ilvl w:val="0"/>
+          <w:numId w:val="6"/>
+        </w:numPr>
+        <w:spacing w:after="60"/>
+      </w:pPr>
+      <w:r>
+        <w:t xml:space="preserve">Feature / avoid: say what to prefer or keep out of the shorts.</w:t>
+      </w:r>
+    </w:p>
+    <w:p>
+      <w:pPr>
+        <w:pStyle w:val="ListParagraph"/>
+        <w:numPr>
+          <w:ilvl w:val="0"/>
+          <w:numId w:val="6"/>
+        </w:numPr>
+        <w:spacing w:after="60"/>
+      </w:pPr>
+      <w:r>
+        <w:t xml:space="preserve">Names and terms: character and place names, so the captions spell them right.</w:t>
+      </w:r>
+    </w:p>
+    <w:p>
+      <w:pPr>
+        <w:pStyle w:val="ListParagraph"/>
+        <w:numPr>
+          <w:ilvl w:val="0"/>
+          <w:numId w:val="6"/>
+        </w:numPr>
+        <w:spacing w:after="60"/>
+      </w:pPr>
+      <w:r>
+        <w:t xml:space="preserve">Leave out of every short: billboards, sponsor reads, credits, narration, host talk, recaps, teasers, black, logos, title cards, and talking heads. All are ticked by default; untick one to allow it.</w:t>
+      </w:r>
+    </w:p>
+    <w:p>
+      <w:pPr>
+        <w:pStyle w:val="ListParagraph"/>
+        <w:numPr>
+          <w:ilvl w:val="0"/>
+          <w:numId w:val="6"/>
+        </w:numPr>
+        <w:spacing w:after="60"/>
+      </w:pPr>
+      <w:r>
+        <w:t xml:space="preserve">Leave out these parts: time ranges such as 0:00-1:45, 22:10-23:30 that no moment may include.</w:t>
+      </w:r>
+    </w:p>
+    <w:p>
+      <w:pPr>
+        <w:pStyle w:val="ListParagraph"/>
+        <w:numPr>
+          <w:ilvl w:val="0"/>
+          <w:numId w:val="6"/>
+        </w:numPr>
+        <w:spacing w:after="60"/>
+      </w:pPr>
+      <w:r>
+        <w:t xml:space="preserve">Advanced: choose the AI vision model, story model, and frames to rate.</w:t>
       </w:r>
     </w:p>
     <w:p>
@@ -770,7 +1499,7 @@
       <w:r>
         <w:drawing>
           <wp:inline distT="0" distB="0" distL="0" distR="0">
-            <wp:extent cx="5715000" cy="3876675"/>
+            <wp:extent cx="5715000" cy="2657475"/>
             <wp:effectExtent t="0" r="0" b="0" l="0"/>
             <wp:docPr id="1" name="" descr="" title=""/>
             <wp:cNvGraphicFramePr>
@@ -795,7 +1524,7 @@
                   <pic:spPr bwMode="auto">
                     <a:xfrm>
                       <a:off x="0" y="0"/>
-                      <a:ext cx="5715000" cy="3876675"/>
+                      <a:ext cx="5715000" cy="2657475"/>
                     </a:xfrm>
                     <a:prstGeom prst="rect">
                       <a:avLst/>
@@ -821,20 +1550,101 @@
           <w:sz w:val="18"/>
           <w:szCs w:val="18"/>
         </w:rPr>
-        <w:t xml:space="preserve">Figure 6. Moments list, player and Trim tab</w:t>
-      </w:r>
-    </w:p>
-    <w:p>
-      <w:pPr>
-        <w:pStyle w:val="ListParagraph"/>
-        <w:numPr>
-          <w:ilvl w:val="0"/>
-          <w:numId w:val="7"/>
-        </w:numPr>
-        <w:spacing w:after="80"/>
-      </w:pPr>
-      <w:r>
-        <w:t xml:space="preserve">Untick a moment in the left list to leave it out. Select one to preview it in the 9:16 player.</w:t>
+        <w:t xml:space="preserve">Figure 6. More options</w:t>
+      </w:r>
+    </w:p>
+    <w:p>
+      <w:pPr>
+        <w:pStyle w:val="Heading1"/>
+      </w:pPr>
+      <w:r>
+        <w:t xml:space="preserve">6. Output settings</w:t>
+      </w:r>
+    </w:p>
+    <w:p>
+      <w:pPr>
+        <w:spacing w:after="120"/>
+      </w:pPr>
+      <w:r>
+        <w:t xml:space="preserve">Output settings holds the defaults for the batch. They are saved to the project, and you can save a set as a template.</w:t>
+      </w:r>
+    </w:p>
+    <w:p>
+      <w:pPr>
+        <w:pStyle w:val="ListParagraph"/>
+        <w:numPr>
+          <w:ilvl w:val="0"/>
+          <w:numId w:val="6"/>
+        </w:numPr>
+        <w:spacing w:after="60"/>
+      </w:pPr>
+      <w:r>
+        <w:t xml:space="preserve">Framing: Auto reframes two-shots by splitting the screen, else follows the subject. "Follow the speaker" tracks who talks.</w:t>
+      </w:r>
+    </w:p>
+    <w:p>
+      <w:pPr>
+        <w:pStyle w:val="ListParagraph"/>
+        <w:numPr>
+          <w:ilvl w:val="0"/>
+          <w:numId w:val="6"/>
+        </w:numPr>
+        <w:spacing w:after="60"/>
+      </w:pPr>
+      <w:r>
+        <w:t xml:space="preserve">Cuts: how pieces join (short crossfade by default).</w:t>
+      </w:r>
+    </w:p>
+    <w:p>
+      <w:pPr>
+        <w:pStyle w:val="ListParagraph"/>
+        <w:numPr>
+          <w:ilvl w:val="0"/>
+          <w:numId w:val="6"/>
+        </w:numPr>
+        <w:spacing w:after="60"/>
+      </w:pPr>
+      <w:r>
+        <w:t xml:space="preserve">Captions: burn in, size, position over a split screen (on the join between the panes or low), and Word highlighting.</w:t>
+      </w:r>
+    </w:p>
+    <w:p>
+      <w:pPr>
+        <w:pStyle w:val="ListParagraph"/>
+        <w:numPr>
+          <w:ilvl w:val="0"/>
+          <w:numId w:val="6"/>
+        </w:numPr>
+        <w:spacing w:after="60"/>
+      </w:pPr>
+      <w:r>
+        <w:t xml:space="preserve">EP labels: opening label (for example "EP {n}") and closing label (for example "NEXT: EP {n} &gt;&gt;"). Type any wording; {n} is the number.</w:t>
+      </w:r>
+    </w:p>
+    <w:p>
+      <w:pPr>
+        <w:pStyle w:val="ListParagraph"/>
+        <w:numPr>
+          <w:ilvl w:val="0"/>
+          <w:numId w:val="6"/>
+        </w:numPr>
+        <w:spacing w:after="60"/>
+      </w:pPr>
+      <w:r>
+        <w:t xml:space="preserve">Delivery: file format and audio level (for example -14 LUFS for online video).</w:t>
+      </w:r>
+    </w:p>
+    <w:p>
+      <w:pPr>
+        <w:pStyle w:val="ListParagraph"/>
+        <w:numPr>
+          <w:ilvl w:val="0"/>
+          <w:numId w:val="6"/>
+        </w:numPr>
+        <w:spacing w:after="60"/>
+      </w:pPr>
+      <w:r>
+        <w:t xml:space="preserve">Ending: the last short can fade to black, so the cliffhanger is not cut or held.</w:t>
       </w:r>
     </w:p>
     <w:p>
@@ -845,7 +1655,7 @@
       <w:r>
         <w:drawing>
           <wp:inline distT="0" distB="0" distL="0" distR="0">
-            <wp:extent cx="2476500" cy="3838575"/>
+            <wp:extent cx="4572000" cy="4095750"/>
             <wp:effectExtent t="0" r="0" b="0" l="0"/>
             <wp:docPr id="1" name="" descr="" title=""/>
             <wp:cNvGraphicFramePr>
@@ -870,7 +1680,7 @@
                   <pic:spPr bwMode="auto">
                     <a:xfrm>
                       <a:off x="0" y="0"/>
-                      <a:ext cx="2476500" cy="3838575"/>
+                      <a:ext cx="4572000" cy="4095750"/>
                     </a:xfrm>
                     <a:prstGeom prst="rect">
                       <a:avLst/>
@@ -896,20 +1706,23 @@
           <w:sz w:val="18"/>
           <w:szCs w:val="18"/>
         </w:rPr>
-        <w:t xml:space="preserve">Figure 7. Moments list: tick, untick and select</w:t>
-      </w:r>
-    </w:p>
-    <w:p>
-      <w:pPr>
-        <w:pStyle w:val="ListParagraph"/>
-        <w:numPr>
-          <w:ilvl w:val="0"/>
-          <w:numId w:val="7"/>
-        </w:numPr>
-        <w:spacing w:after="80"/>
-      </w:pPr>
-      <w:r>
-        <w:t xml:space="preserve">Trim tab: type In and Out, or use the -1, -0.1, +0.1, +1 buttons; in the player use 1 frame, Set In here, Set Out here and Cut from here. The title can be edited. Use Re-analyse this moment to ask the AI again.</w:t>
+        <w:t xml:space="preserve">Figure 7. Output settings panel</w:t>
+      </w:r>
+    </w:p>
+    <w:p>
+      <w:pPr>
+        <w:pStyle w:val="Heading1"/>
+      </w:pPr>
+      <w:r>
+        <w:t xml:space="preserve">7. Moments screen</w:t>
+      </w:r>
+    </w:p>
+    <w:p>
+      <w:pPr>
+        <w:spacing w:after="120"/>
+      </w:pPr>
+      <w:r>
+        <w:t xml:space="preserve">The left list holds the proposed shorts with a score. Use "Add your own moment" for a cut the AI missed.</w:t>
       </w:r>
     </w:p>
     <w:p>
@@ -920,7 +1733,7 @@
       <w:r>
         <w:drawing>
           <wp:inline distT="0" distB="0" distL="0" distR="0">
-            <wp:extent cx="4000500" cy="2990850"/>
+            <wp:extent cx="5715000" cy="3876675"/>
             <wp:effectExtent t="0" r="0" b="0" l="0"/>
             <wp:docPr id="1" name="" descr="" title=""/>
             <wp:cNvGraphicFramePr>
@@ -945,7 +1758,7 @@
                   <pic:spPr bwMode="auto">
                     <a:xfrm>
                       <a:off x="0" y="0"/>
-                      <a:ext cx="4000500" cy="2990850"/>
+                      <a:ext cx="5715000" cy="3876675"/>
                     </a:xfrm>
                     <a:prstGeom prst="rect">
                       <a:avLst/>
@@ -971,54 +1784,20 @@
           <w:sz w:val="18"/>
           <w:szCs w:val="18"/>
         </w:rPr>
-        <w:t xml:space="preserve">Figure 8. Trim tab: In and Out, score, hook and reason</w:t>
-      </w:r>
-    </w:p>
-    <w:p>
-      <w:pPr>
-        <w:pStyle w:val="Heading1"/>
-      </w:pPr>
-      <w:r>
-        <w:t xml:space="preserve">8. Framing</w:t>
-      </w:r>
-    </w:p>
-    <w:p>
-      <w:pPr>
-        <w:pStyle w:val="ListParagraph"/>
-        <w:numPr>
-          <w:ilvl w:val="0"/>
-          <w:numId w:val="8"/>
+        <w:t xml:space="preserve">Figure 8. Moments list, player and Trim tab</w:t>
+      </w:r>
+    </w:p>
+    <w:p>
+      <w:pPr>
+        <w:pStyle w:val="ListParagraph"/>
+        <w:numPr>
+          <w:ilvl w:val="0"/>
+          <w:numId w:val="7"/>
         </w:numPr>
         <w:spacing w:after="80"/>
       </w:pPr>
       <w:r>
-        <w:t xml:space="preserve">Open the Framing tab. Each shot of the moment shows a dashed crop box.</w:t>
-      </w:r>
-    </w:p>
-    <w:p>
-      <w:pPr>
-        <w:pStyle w:val="ListParagraph"/>
-        <w:numPr>
-          <w:ilvl w:val="0"/>
-          <w:numId w:val="8"/>
-        </w:numPr>
-        <w:spacing w:after="80"/>
-      </w:pPr>
-      <w:r>
-        <w:t xml:space="preserve">For each shot choose As worked out, Centre crop, Crop here (slide the box), Whole frame, or Split screen (two people stacked).</w:t>
-      </w:r>
-    </w:p>
-    <w:p>
-      <w:pPr>
-        <w:pStyle w:val="ListParagraph"/>
-        <w:numPr>
-          <w:ilvl w:val="0"/>
-          <w:numId w:val="8"/>
-        </w:numPr>
-        <w:spacing w:after="80"/>
-      </w:pPr>
-      <w:r>
-        <w:t xml:space="preserve">Press "Show in the preview" to see the result, captions and all, in the 9:16 player. The 9:16 preview does not autoplay; press play when ready.</w:t>
+        <w:t xml:space="preserve">Untick a moment in the left list to leave it out. Select one to preview it in the 9:16 player.</w:t>
       </w:r>
     </w:p>
     <w:p>
@@ -1029,7 +1808,7 @@
       <w:r>
         <w:drawing>
           <wp:inline distT="0" distB="0" distL="0" distR="0">
-            <wp:extent cx="5715000" cy="3876675"/>
+            <wp:extent cx="2476500" cy="3838575"/>
             <wp:effectExtent t="0" r="0" b="0" l="0"/>
             <wp:docPr id="1" name="" descr="" title=""/>
             <wp:cNvGraphicFramePr>
@@ -1054,7 +1833,7 @@
                   <pic:spPr bwMode="auto">
                     <a:xfrm>
                       <a:off x="0" y="0"/>
-                      <a:ext cx="5715000" cy="3876675"/>
+                      <a:ext cx="2476500" cy="3838575"/>
                     </a:xfrm>
                     <a:prstGeom prst="rect">
                       <a:avLst/>
@@ -1080,7 +1859,20 @@
           <w:sz w:val="18"/>
           <w:szCs w:val="18"/>
         </w:rPr>
-        <w:t xml:space="preserve">Figure 9. Framing tab</w:t>
+        <w:t xml:space="preserve">Figure 9. Moments list: tick, untick and select</w:t>
+      </w:r>
+    </w:p>
+    <w:p>
+      <w:pPr>
+        <w:pStyle w:val="ListParagraph"/>
+        <w:numPr>
+          <w:ilvl w:val="0"/>
+          <w:numId w:val="7"/>
+        </w:numPr>
+        <w:spacing w:after="80"/>
+      </w:pPr>
+      <w:r>
+        <w:t xml:space="preserve">Trim tab: type In and Out, or use the -1, -0.1, +0.1, +1 buttons; in the player use 1 frame, Set In here, Set Out here and Cut from here. The title can be edited. Use Re-analyse this moment to ask the AI again.</w:t>
       </w:r>
     </w:p>
     <w:p>
@@ -1091,7 +1883,7 @@
       <w:r>
         <w:drawing>
           <wp:inline distT="0" distB="0" distL="0" distR="0">
-            <wp:extent cx="4000500" cy="2390775"/>
+            <wp:extent cx="4000500" cy="2990850"/>
             <wp:effectExtent t="0" r="0" b="0" l="0"/>
             <wp:docPr id="1" name="" descr="" title=""/>
             <wp:cNvGraphicFramePr>
@@ -1116,7 +1908,7 @@
                   <pic:spPr bwMode="auto">
                     <a:xfrm>
                       <a:off x="0" y="0"/>
-                      <a:ext cx="4000500" cy="2390775"/>
+                      <a:ext cx="4000500" cy="2990850"/>
                     </a:xfrm>
                     <a:prstGeom prst="rect">
                       <a:avLst/>
@@ -1142,7 +1934,7 @@
           <w:sz w:val="18"/>
           <w:szCs w:val="18"/>
         </w:rPr>
-        <w:t xml:space="preserve">Figure 10. Framing options per shot and the Show in the preview button</w:t>
+        <w:t xml:space="preserve">Figure 10. Trim tab: In and Out, score, hook and reason</w:t>
       </w:r>
     </w:p>
     <w:p>
@@ -1150,15 +1942,46 @@
         <w:pStyle w:val="Heading1"/>
       </w:pPr>
       <w:r>
-        <w:t xml:space="preserve">9. Captions and dialogue</w:t>
-      </w:r>
-    </w:p>
-    <w:p>
-      <w:pPr>
-        <w:spacing w:after="120"/>
-      </w:pPr>
-      <w:r>
-        <w:t xml:space="preserve">The Captions tab edits the caption text and timing of the burned-in subtitles. The Dialogue tab shows the transcript lines for the moment.</w:t>
+        <w:t xml:space="preserve">8. Framing</w:t>
+      </w:r>
+    </w:p>
+    <w:p>
+      <w:pPr>
+        <w:pStyle w:val="ListParagraph"/>
+        <w:numPr>
+          <w:ilvl w:val="0"/>
+          <w:numId w:val="8"/>
+        </w:numPr>
+        <w:spacing w:after="80"/>
+      </w:pPr>
+      <w:r>
+        <w:t xml:space="preserve">Open the Framing tab. Each shot of the moment shows a dashed crop box.</w:t>
+      </w:r>
+    </w:p>
+    <w:p>
+      <w:pPr>
+        <w:pStyle w:val="ListParagraph"/>
+        <w:numPr>
+          <w:ilvl w:val="0"/>
+          <w:numId w:val="8"/>
+        </w:numPr>
+        <w:spacing w:after="80"/>
+      </w:pPr>
+      <w:r>
+        <w:t xml:space="preserve">For each shot choose As worked out, Centre crop, Crop here (slide the box), Whole frame, or Split screen (two people stacked).</w:t>
+      </w:r>
+    </w:p>
+    <w:p>
+      <w:pPr>
+        <w:pStyle w:val="ListParagraph"/>
+        <w:numPr>
+          <w:ilvl w:val="0"/>
+          <w:numId w:val="8"/>
+        </w:numPr>
+        <w:spacing w:after="80"/>
+      </w:pPr>
+      <w:r>
+        <w:t xml:space="preserve">Press "Show in the preview" to see the result, captions and all, in the 9:16 player. The 9:16 preview does not autoplay; press play when ready.</w:t>
       </w:r>
     </w:p>
     <w:p>
@@ -1220,7 +2043,7 @@
           <w:sz w:val="18"/>
           <w:szCs w:val="18"/>
         </w:rPr>
-        <w:t xml:space="preserve">Figure 11. Captions tab</w:t>
+        <w:t xml:space="preserve">Figure 11. Framing tab</w:t>
       </w:r>
     </w:p>
     <w:p>
@@ -1231,7 +2054,7 @@
       <w:r>
         <w:drawing>
           <wp:inline distT="0" distB="0" distL="0" distR="0">
-            <wp:extent cx="5715000" cy="3876675"/>
+            <wp:extent cx="4000500" cy="2390775"/>
             <wp:effectExtent t="0" r="0" b="0" l="0"/>
             <wp:docPr id="1" name="" descr="" title=""/>
             <wp:cNvGraphicFramePr>
@@ -1256,7 +2079,7 @@
                   <pic:spPr bwMode="auto">
                     <a:xfrm>
                       <a:off x="0" y="0"/>
-                      <a:ext cx="5715000" cy="3876675"/>
+                      <a:ext cx="4000500" cy="2390775"/>
                     </a:xfrm>
                     <a:prstGeom prst="rect">
                       <a:avLst/>
@@ -1282,7 +2105,7 @@
           <w:sz w:val="18"/>
           <w:szCs w:val="18"/>
         </w:rPr>
-        <w:t xml:space="preserve">Figure 12. Dialogue tab</w:t>
+        <w:t xml:space="preserve">Figure 12. Framing options per shot and the Show in the preview button</w:t>
       </w:r>
     </w:p>
     <w:p>
@@ -1290,46 +2113,15 @@
         <w:pStyle w:val="Heading1"/>
       </w:pPr>
       <w:r>
-        <w:t xml:space="preserve">10. Render</w:t>
-      </w:r>
-    </w:p>
-    <w:p>
-      <w:pPr>
-        <w:pStyle w:val="ListParagraph"/>
-        <w:numPr>
-          <w:ilvl w:val="0"/>
-          <w:numId w:val="9"/>
-        </w:numPr>
-        <w:spacing w:after="80"/>
-      </w:pPr>
-      <w:r>
-        <w:t xml:space="preserve">Check the footer: ticked moments, total running time against the source.</w:t>
-      </w:r>
-    </w:p>
-    <w:p>
-      <w:pPr>
-        <w:pStyle w:val="ListParagraph"/>
-        <w:numPr>
-          <w:ilvl w:val="0"/>
-          <w:numId w:val="9"/>
-        </w:numPr>
-        <w:spacing w:after="80"/>
-      </w:pPr>
-      <w:r>
-        <w:t xml:space="preserve">Leave "Replace the earlier render of a moment" ticked to re-render a single short in place.</w:t>
-      </w:r>
-    </w:p>
-    <w:p>
-      <w:pPr>
-        <w:pStyle w:val="ListParagraph"/>
-        <w:numPr>
-          <w:ilvl w:val="0"/>
-          <w:numId w:val="9"/>
-        </w:numPr>
-        <w:spacing w:after="80"/>
-      </w:pPr>
-      <w:r>
-        <w:t xml:space="preserve">Press Render N shorts. The queue shows each short as it encodes. A light preview copy is made for smooth playback over Wi-Fi or VPN.</w:t>
+        <w:t xml:space="preserve">9. Captions and dialogue</w:t>
+      </w:r>
+    </w:p>
+    <w:p>
+      <w:pPr>
+        <w:spacing w:after="120"/>
+      </w:pPr>
+      <w:r>
+        <w:t xml:space="preserve">The Captions tab edits the caption text and timing of the burned-in subtitles. The Dialogue tab shows the transcript lines for the moment.</w:t>
       </w:r>
     </w:p>
     <w:p>
@@ -1340,7 +2132,7 @@
       <w:r>
         <w:drawing>
           <wp:inline distT="0" distB="0" distL="0" distR="0">
-            <wp:extent cx="5715000" cy="1590675"/>
+            <wp:extent cx="5715000" cy="3876675"/>
             <wp:effectExtent t="0" r="0" b="0" l="0"/>
             <wp:docPr id="1" name="" descr="" title=""/>
             <wp:cNvGraphicFramePr>
@@ -1365,7 +2157,7 @@
                   <pic:spPr bwMode="auto">
                     <a:xfrm>
                       <a:off x="0" y="0"/>
-                      <a:ext cx="5715000" cy="1590675"/>
+                      <a:ext cx="5715000" cy="3876675"/>
                     </a:xfrm>
                     <a:prstGeom prst="rect">
                       <a:avLst/>
@@ -1391,23 +2183,7 @@
           <w:sz w:val="18"/>
           <w:szCs w:val="18"/>
         </w:rPr>
-        <w:t xml:space="preserve">Figure 13. Render progress in the queue</w:t>
-      </w:r>
-    </w:p>
-    <w:p>
-      <w:pPr>
-        <w:pStyle w:val="Heading1"/>
-      </w:pPr>
-      <w:r>
-        <w:t xml:space="preserve">11. Results</w:t>
-      </w:r>
-    </w:p>
-    <w:p>
-      <w:pPr>
-        <w:spacing w:after="120"/>
-      </w:pPr>
-      <w:r>
-        <w:t xml:space="preserve">When finished, press "Show the shorts", or open the "Shorts in this project" tab. Each short shows its title, length, size and shot treatment. Click to play; download MP4 or SRT, edit Captions, or use "Download all (.zip)".</w:t>
+        <w:t xml:space="preserve">Figure 13. Captions tab</w:t>
       </w:r>
     </w:p>
     <w:p>
@@ -1418,7 +2194,7 @@
       <w:r>
         <w:drawing>
           <wp:inline distT="0" distB="0" distL="0" distR="0">
-            <wp:extent cx="5715000" cy="3352800"/>
+            <wp:extent cx="5715000" cy="3876675"/>
             <wp:effectExtent t="0" r="0" b="0" l="0"/>
             <wp:docPr id="1" name="" descr="" title=""/>
             <wp:cNvGraphicFramePr>
@@ -1443,6 +2219,193 @@
                   <pic:spPr bwMode="auto">
                     <a:xfrm>
                       <a:off x="0" y="0"/>
+                      <a:ext cx="5715000" cy="3876675"/>
+                    </a:xfrm>
+                    <a:prstGeom prst="rect">
+                      <a:avLst/>
+                    </a:prstGeom>
+                  </pic:spPr>
+                </pic:pic>
+              </a:graphicData>
+            </a:graphic>
+          </wp:inline>
+        </w:drawing>
+      </w:r>
+    </w:p>
+    <w:p>
+      <w:pPr>
+        <w:spacing w:after="200"/>
+        <w:jc w:val="center"/>
+      </w:pPr>
+      <w:r>
+        <w:rPr>
+          <w:i/>
+          <w:iCs/>
+          <w:color w:val="666666"/>
+          <w:sz w:val="18"/>
+          <w:szCs w:val="18"/>
+        </w:rPr>
+        <w:t xml:space="preserve">Figure 14. Dialogue tab</w:t>
+      </w:r>
+    </w:p>
+    <w:p>
+      <w:pPr>
+        <w:pStyle w:val="Heading1"/>
+      </w:pPr>
+      <w:r>
+        <w:t xml:space="preserve">10. Render</w:t>
+      </w:r>
+    </w:p>
+    <w:p>
+      <w:pPr>
+        <w:pStyle w:val="ListParagraph"/>
+        <w:numPr>
+          <w:ilvl w:val="0"/>
+          <w:numId w:val="9"/>
+        </w:numPr>
+        <w:spacing w:after="80"/>
+      </w:pPr>
+      <w:r>
+        <w:t xml:space="preserve">Check the footer: ticked moments, total running time against the source.</w:t>
+      </w:r>
+    </w:p>
+    <w:p>
+      <w:pPr>
+        <w:pStyle w:val="ListParagraph"/>
+        <w:numPr>
+          <w:ilvl w:val="0"/>
+          <w:numId w:val="9"/>
+        </w:numPr>
+        <w:spacing w:after="80"/>
+      </w:pPr>
+      <w:r>
+        <w:t xml:space="preserve">Leave "Replace the earlier render of a moment" ticked to re-render a single short in place.</w:t>
+      </w:r>
+    </w:p>
+    <w:p>
+      <w:pPr>
+        <w:pStyle w:val="ListParagraph"/>
+        <w:numPr>
+          <w:ilvl w:val="0"/>
+          <w:numId w:val="9"/>
+        </w:numPr>
+        <w:spacing w:after="80"/>
+      </w:pPr>
+      <w:r>
+        <w:t xml:space="preserve">Press Render N shorts. The queue shows each short as it encodes. A light preview copy is made for smooth playback over Wi-Fi or VPN.</w:t>
+      </w:r>
+    </w:p>
+    <w:p>
+      <w:pPr>
+        <w:spacing w:after="60" w:before="120"/>
+        <w:jc w:val="center"/>
+      </w:pPr>
+      <w:r>
+        <w:drawing>
+          <wp:inline distT="0" distB="0" distL="0" distR="0">
+            <wp:extent cx="5715000" cy="1590675"/>
+            <wp:effectExtent t="0" r="0" b="0" l="0"/>
+            <wp:docPr id="1" name="" descr="" title=""/>
+            <wp:cNvGraphicFramePr>
+              <a:graphicFrameLocks xmlns:a="http://schemas.openxmlformats.org/drawingml/2006/main" noChangeAspect="1"/>
+            </wp:cNvGraphicFramePr>
+            <a:graphic xmlns:a="http://schemas.openxmlformats.org/drawingml/2006/main">
+              <a:graphicData uri="http://schemas.openxmlformats.org/drawingml/2006/picture">
+                <pic:pic xmlns:pic="http://schemas.openxmlformats.org/drawingml/2006/picture">
+                  <pic:nvPicPr>
+                    <pic:cNvPr id="0" name="" descr=""/>
+                    <pic:cNvPicPr>
+                      <a:picLocks noChangeAspect="1" noChangeArrowheads="1"/>
+                    </pic:cNvPicPr>
+                  </pic:nvPicPr>
+                  <pic:blipFill>
+                    <a:blip r:embed="rId21" cstate="none"/>
+                    <a:srcRect/>
+                    <a:stretch>
+                      <a:fillRect/>
+                    </a:stretch>
+                  </pic:blipFill>
+                  <pic:spPr bwMode="auto">
+                    <a:xfrm>
+                      <a:off x="0" y="0"/>
+                      <a:ext cx="5715000" cy="1590675"/>
+                    </a:xfrm>
+                    <a:prstGeom prst="rect">
+                      <a:avLst/>
+                    </a:prstGeom>
+                  </pic:spPr>
+                </pic:pic>
+              </a:graphicData>
+            </a:graphic>
+          </wp:inline>
+        </w:drawing>
+      </w:r>
+    </w:p>
+    <w:p>
+      <w:pPr>
+        <w:spacing w:after="200"/>
+        <w:jc w:val="center"/>
+      </w:pPr>
+      <w:r>
+        <w:rPr>
+          <w:i/>
+          <w:iCs/>
+          <w:color w:val="666666"/>
+          <w:sz w:val="18"/>
+          <w:szCs w:val="18"/>
+        </w:rPr>
+        <w:t xml:space="preserve">Figure 15. Render progress in the queue</w:t>
+      </w:r>
+    </w:p>
+    <w:p>
+      <w:pPr>
+        <w:pStyle w:val="Heading1"/>
+      </w:pPr>
+      <w:r>
+        <w:t xml:space="preserve">11. Results</w:t>
+      </w:r>
+    </w:p>
+    <w:p>
+      <w:pPr>
+        <w:spacing w:after="120"/>
+      </w:pPr>
+      <w:r>
+        <w:t xml:space="preserve">When finished, press "Show the shorts", or open the "Shorts in this project" tab. Each short shows its title, length, size and shot treatment. Click to play; download MP4 or SRT, edit Captions, or use "Download all (.zip)".</w:t>
+      </w:r>
+    </w:p>
+    <w:p>
+      <w:pPr>
+        <w:spacing w:after="60" w:before="120"/>
+        <w:jc w:val="center"/>
+      </w:pPr>
+      <w:r>
+        <w:drawing>
+          <wp:inline distT="0" distB="0" distL="0" distR="0">
+            <wp:extent cx="5715000" cy="3352800"/>
+            <wp:effectExtent t="0" r="0" b="0" l="0"/>
+            <wp:docPr id="1" name="" descr="" title=""/>
+            <wp:cNvGraphicFramePr>
+              <a:graphicFrameLocks xmlns:a="http://schemas.openxmlformats.org/drawingml/2006/main" noChangeAspect="1"/>
+            </wp:cNvGraphicFramePr>
+            <a:graphic xmlns:a="http://schemas.openxmlformats.org/drawingml/2006/main">
+              <a:graphicData uri="http://schemas.openxmlformats.org/drawingml/2006/picture">
+                <pic:pic xmlns:pic="http://schemas.openxmlformats.org/drawingml/2006/picture">
+                  <pic:nvPicPr>
+                    <pic:cNvPr id="0" name="" descr=""/>
+                    <pic:cNvPicPr>
+                      <a:picLocks noChangeAspect="1" noChangeArrowheads="1"/>
+                    </pic:cNvPicPr>
+                  </pic:nvPicPr>
+                  <pic:blipFill>
+                    <a:blip r:embed="rId22" cstate="none"/>
+                    <a:srcRect/>
+                    <a:stretch>
+                      <a:fillRect/>
+                    </a:stretch>
+                  </pic:blipFill>
+                  <pic:spPr bwMode="auto">
+                    <a:xfrm>
+                      <a:off x="0" y="0"/>
                       <a:ext cx="5715000" cy="3352800"/>
                     </a:xfrm>
                     <a:prstGeom prst="rect">
@@ -1469,7 +2432,7 @@
           <w:sz w:val="18"/>
           <w:szCs w:val="18"/>
         </w:rPr>
-        <w:t xml:space="preserve">Figure 14. Shorts in this project</w:t>
+        <w:t xml:space="preserve">Figure 16. Shorts in this project</w:t>
       </w:r>
     </w:p>
     <w:p>

</xml_diff>

<commit_message>
Update Vertical Shorts procedure for Mini-drama selection and newer features
Co-Authored-By: Claude Sonnet 5.5 <noreply@anthropic.com>
Claude-Session: https://claude.ai/code/session_01UAszi8mBYYvS2GbFNgviD8
</commit_message>
<xml_diff>
--- a/docs/reference/PRISM_Vertical_Shorts_Procedure.docx
+++ b/docs/reference/PRISM_Vertical_Shorts_Procedure.docx
@@ -28,7 +28,7 @@
         <w:spacing w:after="120"/>
       </w:pPr>
       <w:r>
-        <w:t xml:space="preserve">Vertical Shorts cuts a long-form programme into stand-alone 9:16 clips. The AI Vision model rates the picture, the dialogue is transcribed, and a story model proposes stretches that stand on their own. You review, adjust and render.</w:t>
+        <w:t xml:space="preserve">Vertical Shorts cuts a long-form programme into 9:16 clips. This procedure uses the Mini-drama selection: the whole episode is cut into consecutive chapters, in order, none skipped, each opening with an EP label and closing with NEXT: EP n+1. You review, adjust and render. (The other selections, Best moments and Highlight reel, are described in section 5.)</w:t>
       </w:r>
     </w:p>
     <w:p>
@@ -36,7 +36,7 @@
         <w:spacing w:after="120"/>
       </w:pPr>
       <w:r>
-        <w:t xml:space="preserve">Note: the screenshots are from the real PRISM screens, using a synthetic sample episode and mocked AI services, so the moments and scores are illustrative.</w:t>
+        <w:t xml:space="preserve">Note: the screenshots are from the real PRISM screens, using a synthetic sample episode and mocked AI services, so the chapter text and scores are illustrative.</w:t>
       </w:r>
     </w:p>
     <w:p>
@@ -70,7 +70,7 @@
         <w:spacing w:after="80"/>
       </w:pPr>
       <w:r>
-        <w:t xml:space="preserve">Source: pick the video, set length, and analyse.</w:t>
+        <w:t xml:space="preserve">Source: pick the video, choose What to make = Mini-drama, set the chapter length, and analyse.</w:t>
       </w:r>
     </w:p>
     <w:p>
@@ -83,7 +83,7 @@
         <w:spacing w:after="80"/>
       </w:pPr>
       <w:r>
-        <w:t xml:space="preserve">Moments: review, trim, reframe and caption each short.</w:t>
+        <w:t xml:space="preserve">Moments: review each chapter (Ep 1, Ep 2 ...), trim, reframe and caption it.</w:t>
       </w:r>
     </w:p>
     <w:p>
@@ -258,7 +258,7 @@
       <w:r>
         <w:drawing>
           <wp:inline distT="0" distB="0" distL="0" distR="0">
-            <wp:extent cx="5715000" cy="2343150"/>
+            <wp:extent cx="5715000" cy="2657475"/>
             <wp:effectExtent t="0" r="0" b="0" l="0"/>
             <wp:docPr id="1" name="" descr="" title=""/>
             <wp:cNvGraphicFramePr>
@@ -283,7 +283,7 @@
                   <pic:spPr bwMode="auto">
                     <a:xfrm>
                       <a:off x="0" y="0"/>
-                      <a:ext cx="5715000" cy="2343150"/>
+                      <a:ext cx="5715000" cy="2657475"/>
                     </a:xfrm>
                     <a:prstGeom prst="rect">
                       <a:avLst/>
@@ -1324,7 +1324,7 @@
         <w:spacing w:after="80"/>
       </w:pPr>
       <w:r>
-        <w:t xml:space="preserve">Set "What to make", the length of each short (for example 20 to 40 s), the number of moments to find, and the spoken language (Auto-detect for mixed Filipino and English).</w:t>
+        <w:t xml:space="preserve">Set "What to make" to Mini-drama (not Best moments). PRISM then uses every stretch of the story in order. Billboards, credits, the host and the other ticked material (section 5) are left out and the chapters carry on after them.</w:t>
       </w:r>
     </w:p>
     <w:p>
@@ -1337,7 +1337,33 @@
         <w:spacing w:after="80"/>
       </w:pPr>
       <w:r>
-        <w:t xml:space="preserve">Press Analyse. A queue card shows progress. When it says "Ready to review" the Moments screen opens.</w:t>
+        <w:t xml:space="preserve">Set the length of each short as a range, for example 60 to 90 s for 1:30 chapters. Each chapter ends at the end of a spoken line, near a shot cut, at the strongest nearby beat, so lengths vary inside the range. "Moments to find", Focus and Avoid do not apply to Mini-drama.</w:t>
+      </w:r>
+    </w:p>
+    <w:p>
+      <w:pPr>
+        <w:pStyle w:val="ListParagraph"/>
+        <w:numPr>
+          <w:ilvl w:val="0"/>
+          <w:numId w:val="5"/>
+        </w:numPr>
+        <w:spacing w:after="80"/>
+      </w:pPr>
+      <w:r>
+        <w:t xml:space="preserve">Set the spoken language (Auto-detect for mixed Filipino and English).</w:t>
+      </w:r>
+    </w:p>
+    <w:p>
+      <w:pPr>
+        <w:pStyle w:val="ListParagraph"/>
+        <w:numPr>
+          <w:ilvl w:val="0"/>
+          <w:numId w:val="5"/>
+        </w:numPr>
+        <w:spacing w:after="80"/>
+      </w:pPr>
+      <w:r>
+        <w:t xml:space="preserve">Press Analyse. A queue card shows progress. When it says "Ready to review" the Moments screen opens with one chapter per row.</w:t>
       </w:r>
     </w:p>
     <w:p>
@@ -1348,7 +1374,7 @@
       <w:r>
         <w:drawing>
           <wp:inline distT="0" distB="0" distL="0" distR="0">
-            <wp:extent cx="5715000" cy="3295650"/>
+            <wp:extent cx="5715000" cy="3000375"/>
             <wp:effectExtent t="0" r="0" b="0" l="0"/>
             <wp:docPr id="1" name="" descr="" title=""/>
             <wp:cNvGraphicFramePr>
@@ -1373,7 +1399,7 @@
                   <pic:spPr bwMode="auto">
                     <a:xfrm>
                       <a:off x="0" y="0"/>
-                      <a:ext cx="5715000" cy="3295650"/>
+                      <a:ext cx="5715000" cy="3000375"/>
                     </a:xfrm>
                     <a:prstGeom prst="rect">
                       <a:avLst/>
@@ -1399,7 +1425,7 @@
           <w:sz w:val="18"/>
           <w:szCs w:val="18"/>
         </w:rPr>
-        <w:t xml:space="preserve">Figure 5. Source screen: video, length, moments and language (see steps 1 to 4)</w:t>
+        <w:t xml:space="preserve">Figure 5. Source screen with Mini-drama selected (see steps 1 to 5)</w:t>
       </w:r>
     </w:p>
     <w:p>
@@ -1436,7 +1462,7 @@
         <w:spacing w:after="60"/>
       </w:pPr>
       <w:r>
-        <w:t xml:space="preserve">Feature / avoid: say what to prefer or keep out of the shorts.</w:t>
+        <w:t xml:space="preserve">Other selections: Best moments lets the AI pick the strongest stand-alone moments (uses Feature / avoid and the number to find); Highlight reel joins the best scenes into one short.</w:t>
       </w:r>
     </w:p>
     <w:p>
@@ -1449,6 +1475,19 @@
         <w:spacing w:after="60"/>
       </w:pPr>
       <w:r>
+        <w:t xml:space="preserve">Feature / avoid: used by Best moments; not used by Mini-drama.</w:t>
+      </w:r>
+    </w:p>
+    <w:p>
+      <w:pPr>
+        <w:pStyle w:val="ListParagraph"/>
+        <w:numPr>
+          <w:ilvl w:val="0"/>
+          <w:numId w:val="6"/>
+        </w:numPr>
+        <w:spacing w:after="60"/>
+      </w:pPr>
+      <w:r>
         <w:t xml:space="preserve">Names and terms: character and place names, so the captions spell them right.</w:t>
       </w:r>
     </w:p>
@@ -1476,6 +1515,19 @@
       </w:pPr>
       <w:r>
         <w:t xml:space="preserve">Leave out these parts: time ranges such as 0:00-1:45, 22:10-23:30 that no moment may include.</w:t>
+      </w:r>
+    </w:p>
+    <w:p>
+      <w:pPr>
+        <w:pStyle w:val="ListParagraph"/>
+        <w:numPr>
+          <w:ilvl w:val="0"/>
+          <w:numId w:val="6"/>
+        </w:numPr>
+        <w:spacing w:after="60"/>
+      </w:pPr>
+      <w:r>
+        <w:t xml:space="preserve">Use my list of moments (CSV): upload title, in, out (optional part, note) and the AI picks nothing; your rows become the moments. Times: 83.5, 1:23.5, 0:01:23.5 or 00:01:23:15. With a list, Mini-drama chaptering is not used.</w:t>
       </w:r>
     </w:p>
     <w:p>
@@ -1499,7 +1551,7 @@
       <w:r>
         <w:drawing>
           <wp:inline distT="0" distB="0" distL="0" distR="0">
-            <wp:extent cx="5715000" cy="2657475"/>
+            <wp:extent cx="5715000" cy="3324225"/>
             <wp:effectExtent t="0" r="0" b="0" l="0"/>
             <wp:docPr id="1" name="" descr="" title=""/>
             <wp:cNvGraphicFramePr>
@@ -1524,7 +1576,7 @@
                   <pic:spPr bwMode="auto">
                     <a:xfrm>
                       <a:off x="0" y="0"/>
-                      <a:ext cx="5715000" cy="2657475"/>
+                      <a:ext cx="5715000" cy="3324225"/>
                     </a:xfrm>
                     <a:prstGeom prst="rect">
                       <a:avLst/>
@@ -1655,7 +1707,7 @@
       <w:r>
         <w:drawing>
           <wp:inline distT="0" distB="0" distL="0" distR="0">
-            <wp:extent cx="4572000" cy="4095750"/>
+            <wp:extent cx="4572000" cy="4133850"/>
             <wp:effectExtent t="0" r="0" b="0" l="0"/>
             <wp:docPr id="1" name="" descr="" title=""/>
             <wp:cNvGraphicFramePr>
@@ -1680,7 +1732,7 @@
                   <pic:spPr bwMode="auto">
                     <a:xfrm>
                       <a:off x="0" y="0"/>
-                      <a:ext cx="4572000" cy="4095750"/>
+                      <a:ext cx="4572000" cy="4133850"/>
                     </a:xfrm>
                     <a:prstGeom prst="rect">
                       <a:avLst/>
@@ -1722,7 +1774,7 @@
         <w:spacing w:after="120"/>
       </w:pPr>
       <w:r>
-        <w:t xml:space="preserve">The left list holds the proposed shorts with a score. Use "Add your own moment" for a cut the AI missed.</w:t>
+        <w:t xml:space="preserve">In Mini-drama the left list holds the chapters in episode order, named Ep 1, Ep 2 ... with the opening words. Each shows its in and out times, length and a score. A chapter can end shorter than the minimum when what is left of a stretch is too short; it is not padded. Use "Add your own moment" to add a cut by hand.</w:t>
       </w:r>
     </w:p>
     <w:p>
@@ -1733,7 +1785,7 @@
       <w:r>
         <w:drawing>
           <wp:inline distT="0" distB="0" distL="0" distR="0">
-            <wp:extent cx="5715000" cy="3876675"/>
+            <wp:extent cx="5715000" cy="4629150"/>
             <wp:effectExtent t="0" r="0" b="0" l="0"/>
             <wp:docPr id="1" name="" descr="" title=""/>
             <wp:cNvGraphicFramePr>
@@ -1758,7 +1810,7 @@
                   <pic:spPr bwMode="auto">
                     <a:xfrm>
                       <a:off x="0" y="0"/>
-                      <a:ext cx="5715000" cy="3876675"/>
+                      <a:ext cx="5715000" cy="4629150"/>
                     </a:xfrm>
                     <a:prstGeom prst="rect">
                       <a:avLst/>
@@ -1808,7 +1860,7 @@
       <w:r>
         <w:drawing>
           <wp:inline distT="0" distB="0" distL="0" distR="0">
-            <wp:extent cx="2476500" cy="3838575"/>
+            <wp:extent cx="2476500" cy="3067050"/>
             <wp:effectExtent t="0" r="0" b="0" l="0"/>
             <wp:docPr id="1" name="" descr="" title=""/>
             <wp:cNvGraphicFramePr>
@@ -1833,7 +1885,7 @@
                   <pic:spPr bwMode="auto">
                     <a:xfrm>
                       <a:off x="0" y="0"/>
-                      <a:ext cx="2476500" cy="3838575"/>
+                      <a:ext cx="2476500" cy="3067050"/>
                     </a:xfrm>
                     <a:prstGeom prst="rect">
                       <a:avLst/>
@@ -1883,7 +1935,7 @@
       <w:r>
         <w:drawing>
           <wp:inline distT="0" distB="0" distL="0" distR="0">
-            <wp:extent cx="4000500" cy="2990850"/>
+            <wp:extent cx="4000500" cy="2790825"/>
             <wp:effectExtent t="0" r="0" b="0" l="0"/>
             <wp:docPr id="1" name="" descr="" title=""/>
             <wp:cNvGraphicFramePr>
@@ -1908,7 +1960,7 @@
                   <pic:spPr bwMode="auto">
                     <a:xfrm>
                       <a:off x="0" y="0"/>
-                      <a:ext cx="4000500" cy="2990850"/>
+                      <a:ext cx="4000500" cy="2790825"/>
                     </a:xfrm>
                     <a:prstGeom prst="rect">
                       <a:avLst/>
@@ -2303,7 +2355,7 @@
       <w:r>
         <w:drawing>
           <wp:inline distT="0" distB="0" distL="0" distR="0">
-            <wp:extent cx="5715000" cy="1590675"/>
+            <wp:extent cx="5715000" cy="1276350"/>
             <wp:effectExtent t="0" r="0" b="0" l="0"/>
             <wp:docPr id="1" name="" descr="" title=""/>
             <wp:cNvGraphicFramePr>
@@ -2328,7 +2380,7 @@
                   <pic:spPr bwMode="auto">
                     <a:xfrm>
                       <a:off x="0" y="0"/>
-                      <a:ext cx="5715000" cy="1590675"/>
+                      <a:ext cx="5715000" cy="1276350"/>
                     </a:xfrm>
                     <a:prstGeom prst="rect">
                       <a:avLst/>
@@ -2466,7 +2518,7 @@
         <w:spacing w:after="60"/>
       </w:pPr>
       <w:r>
-        <w:t xml:space="preserve">Mini-drama chapters can end shorter than the minimum; the leftover at the end of a stretch is not padded.</w:t>
+        <w:t xml:space="preserve">The last chapter of a stretch can be shorter than the minimum; the leftover is not padded.</w:t>
       </w:r>
     </w:p>
     <w:p>
@@ -2493,6 +2545,45 @@
       </w:pPr>
       <w:r>
         <w:t xml:space="preserve">Settings are saved per project and restored on reload.</w:t>
+      </w:r>
+    </w:p>
+    <w:p>
+      <w:pPr>
+        <w:pStyle w:val="ListParagraph"/>
+        <w:numPr>
+          <w:ilvl w:val="0"/>
+          <w:numId w:val="6"/>
+        </w:numPr>
+        <w:spacing w:after="60"/>
+      </w:pPr>
+      <w:r>
+        <w:t xml:space="preserve">TikTok delivery: choose the TikTok format under Delivery for a 1080x1920, 30 fps H.264 file ready to upload.</w:t>
+      </w:r>
+    </w:p>
+    <w:p>
+      <w:pPr>
+        <w:pStyle w:val="ListParagraph"/>
+        <w:numPr>
+          <w:ilvl w:val="0"/>
+          <w:numId w:val="6"/>
+        </w:numPr>
+        <w:spacing w:after="60"/>
+      </w:pPr>
+      <w:r>
+        <w:t xml:space="preserve">Captions from another file: if the episode was cut, Speech to Text &gt; "Retime captions to a cut video" retimes SCC/SRT/VTT parts onto the cut video; supply the result as the caption file in step 4.</w:t>
+      </w:r>
+    </w:p>
+    <w:p>
+      <w:pPr>
+        <w:pStyle w:val="ListParagraph"/>
+        <w:numPr>
+          <w:ilvl w:val="0"/>
+          <w:numId w:val="6"/>
+        </w:numPr>
+        <w:spacing w:after="60"/>
+      </w:pPr>
+      <w:r>
+        <w:t xml:space="preserve">Network folders: Browse library can read from several named sources per category (Config &gt; Network &gt; More sources); a dropdown picks between them.</w:t>
       </w:r>
     </w:p>
     <w:sectPr>

</xml_diff>

<commit_message>
Procedure: use the real button names (Preview the cut / Generate without preview)
Co-Authored-By: Claude Sonnet 5.5 <noreply@anthropic.com>
Claude-Session: https://claude.ai/code/session_01UAszi8mBYYvS2GbFNgviD8
</commit_message>
<xml_diff>
--- a/docs/reference/PRISM_Vertical_Shorts_Procedure.docx
+++ b/docs/reference/PRISM_Vertical_Shorts_Procedure.docx
@@ -70,7 +70,7 @@
         <w:spacing w:after="80"/>
       </w:pPr>
       <w:r>
-        <w:t xml:space="preserve">Source: pick the video, choose What to make = Mini-drama, set the chapter length, and analyse.</w:t>
+        <w:t xml:space="preserve">Source: pick the video, choose What to make = Mini-drama, set the chapter length, and press Preview the cut.</w:t>
       </w:r>
     </w:p>
     <w:p>
@@ -1363,7 +1363,7 @@
         <w:spacing w:after="80"/>
       </w:pPr>
       <w:r>
-        <w:t xml:space="preserve">Press Analyse. A queue card shows progress. When it says "Ready to review" the Moments screen opens with one chapter per row.</w:t>
+        <w:t xml:space="preserve">Press Preview the cut. A queue card shows progress. When it says "Ready to review" the Moments screen opens with one chapter per row, to play, re-time and pick before anything is rendered. (Generate without preview skips the review and renders every chapter at once with the Output settings; use it only when you do not need to check the cut.)</w:t>
       </w:r>
     </w:p>
     <w:p>
@@ -1433,7 +1433,7 @@
         <w:spacing w:after="120"/>
       </w:pPr>
       <w:r>
-        <w:t xml:space="preserve">Earlier cuts of this project are listed at the top. Press Open to return to one without re-analysing; they are kept 14 days after last opened.</w:t>
+        <w:t xml:space="preserve">Earlier cuts of this project are listed at the top. Press Open to return to one without running Preview the cut again; they are kept 14 days after last opened.</w:t>
       </w:r>
     </w:p>
     <w:p>
@@ -2531,7 +2531,7 @@
         <w:spacing w:after="60"/>
       </w:pPr>
       <w:r>
-        <w:t xml:space="preserve">If something unwanted appears (a billboard, a host shot), add its time range under "Leave out these parts" and re-analyse.</w:t>
+        <w:t xml:space="preserve">If something unwanted appears (a billboard, a host shot), add its time range under "Leave out these parts" and press Preview the cut again.</w:t>
       </w:r>
     </w:p>
     <w:p>

</xml_diff>